<commit_message>
Update framework document to v3.0 — complete workflow
</commit_message>
<xml_diff>
--- a/BSS_Risk_Assessment_Framework.docx
+++ b/BSS_Risk_Assessment_Framework.docx
@@ -10,9 +10,9 @@
         <w:rPr>
           <w:b/>
           <w:color w:val="1A3A5C"/>
-          <w:sz w:val="32"/>
+          <w:sz w:val="34"/>
         </w:rPr>
-        <w:t>BSS Branch Audit — Risk Assessment Framework</w:t>
+        <w:t>BSS Branch Audit — Risk Assessment &amp; Review Framework</w:t>
       </w:r>
     </w:p>
     <w:p>
@@ -25,7 +25,7 @@
           <w:color w:val="888888"/>
           <w:sz w:val="20"/>
         </w:rPr>
-        <w:t>Complete Parameter Reference  |  Risk Assessment v2.0</w:t>
+        <w:t>Complete Parameter &amp; Workflow Reference  |  Version 3.0  |  June 2026</w:t>
       </w:r>
     </w:p>
     <w:p/>
@@ -36,7 +36,7 @@
           <w:color w:val="1A3A5C"/>
           <w:sz w:val="26"/>
         </w:rPr>
-        <w:t>PART 1 — Pre-Audit Risk Assessment  (Planning Stage)</w:t>
+        <w:t>SECTION 1 — Pre-Audit Risk Assessment  (Planning Stage)</w:t>
       </w:r>
     </w:p>
     <w:p>
@@ -49,14 +49,15 @@
         <w:t>Purpose: Helps the auditor decide where to focus audit effort before starting the branch audit.</w:t>
       </w:r>
     </w:p>
+    <w:p/>
     <w:p>
       <w:r>
         <w:rPr>
           <w:b/>
           <w:color w:val="1A3A5C"/>
-          <w:sz w:val="20"/>
+          <w:sz w:val="22"/>
         </w:rPr>
-        <w:t>Data Sources (Part 1):</w:t>
+        <w:t>Data Sources (Part 1)</w:t>
       </w:r>
     </w:p>
     <w:p>
@@ -126,14 +127,13 @@
       <w:tblPr>
         <w:tblStyle w:val="TableGrid"/>
         <w:tblW w:type="auto" w:w="0"/>
-        <w:tblLayout w:type="fixed"/>
         <w:tblLook w:firstColumn="1" w:firstRow="1" w:lastColumn="0" w:lastRow="0" w:noHBand="0" w:noVBand="1" w:val="04A0"/>
       </w:tblPr>
       <w:tblGrid>
-        <w:gridCol w:w="3168"/>
+        <w:gridCol w:w="2880"/>
         <w:gridCol w:w="1296"/>
         <w:gridCol w:w="2592"/>
-        <w:gridCol w:w="3024"/>
+        <w:gridCol w:w="3312"/>
       </w:tblGrid>
       <w:tr>
         <w:tc>
@@ -255,9 +255,6 @@
             <w:vAlign w:val="center"/>
           </w:tcPr>
           <w:p>
-            <w:pPr>
-              <w:jc w:val="left"/>
-            </w:pPr>
             <w:r>
               <w:rPr>
                 <w:color w:val="2A3A50"/>
@@ -280,9 +277,6 @@
             <w:vAlign w:val="center"/>
           </w:tcPr>
           <w:p>
-            <w:pPr>
-              <w:jc w:val="left"/>
-            </w:pPr>
             <w:r>
               <w:rPr>
                 <w:color w:val="2A3A50"/>
@@ -305,9 +299,6 @@
             <w:vAlign w:val="center"/>
           </w:tcPr>
           <w:p>
-            <w:pPr>
-              <w:jc w:val="left"/>
-            </w:pPr>
             <w:r>
               <w:rPr>
                 <w:color w:val="2A3A50"/>
@@ -330,9 +321,6 @@
             <w:vAlign w:val="center"/>
           </w:tcPr>
           <w:p>
-            <w:pPr>
-              <w:jc w:val="left"/>
-            </w:pPr>
             <w:r>
               <w:rPr>
                 <w:color w:val="2A3A50"/>
@@ -357,9 +345,6 @@
             <w:vAlign w:val="center"/>
           </w:tcPr>
           <w:p>
-            <w:pPr>
-              <w:jc w:val="left"/>
-            </w:pPr>
             <w:r>
               <w:rPr>
                 <w:color w:val="2A3A50"/>
@@ -382,9 +367,6 @@
             <w:vAlign w:val="center"/>
           </w:tcPr>
           <w:p>
-            <w:pPr>
-              <w:jc w:val="left"/>
-            </w:pPr>
             <w:r>
               <w:rPr>
                 <w:color w:val="2A3A50"/>
@@ -407,9 +389,6 @@
             <w:vAlign w:val="center"/>
           </w:tcPr>
           <w:p>
-            <w:pPr>
-              <w:jc w:val="left"/>
-            </w:pPr>
             <w:r>
               <w:rPr>
                 <w:color w:val="2A3A50"/>
@@ -432,9 +411,6 @@
             <w:vAlign w:val="center"/>
           </w:tcPr>
           <w:p>
-            <w:pPr>
-              <w:jc w:val="left"/>
-            </w:pPr>
             <w:r>
               <w:rPr>
                 <w:color w:val="2A3A50"/>
@@ -457,12 +433,8 @@
               <w:right w:val="single" w:sz="4" w:color="B0C4DE"/>
             </w:tcBorders>
             <w:vAlign w:val="center"/>
-            <w:shd w:val="clear" w:color="auto" w:fill="FFF3E0"/>
           </w:tcPr>
           <w:p>
-            <w:pPr>
-              <w:jc w:val="left"/>
-            </w:pPr>
             <w:r>
               <w:rPr>
                 <w:color w:val="2A3A50"/>
@@ -483,12 +455,8 @@
               <w:right w:val="single" w:sz="4" w:color="B0C4DE"/>
             </w:tcBorders>
             <w:vAlign w:val="center"/>
-            <w:shd w:val="clear" w:color="auto" w:fill="FFF3E0"/>
           </w:tcPr>
           <w:p>
-            <w:pPr>
-              <w:jc w:val="left"/>
-            </w:pPr>
             <w:r>
               <w:rPr>
                 <w:color w:val="2A3A50"/>
@@ -509,12 +477,8 @@
               <w:right w:val="single" w:sz="4" w:color="B0C4DE"/>
             </w:tcBorders>
             <w:vAlign w:val="center"/>
-            <w:shd w:val="clear" w:color="auto" w:fill="FFF3E0"/>
           </w:tcPr>
           <w:p>
-            <w:pPr>
-              <w:jc w:val="left"/>
-            </w:pPr>
             <w:r>
               <w:rPr>
                 <w:color w:val="2A3A50"/>
@@ -537,20 +501,16 @@
               <w:right w:val="single" w:sz="4" w:color="B0C4DE"/>
             </w:tcBorders>
             <w:vAlign w:val="center"/>
-            <w:shd w:val="clear" w:color="auto" w:fill="FFF3E0"/>
           </w:tcPr>
           <w:p>
-            <w:pPr>
-              <w:jc w:val="left"/>
-            </w:pPr>
             <w:r>
               <w:rPr>
                 <w:color w:val="2A3A50"/>
                 <w:sz w:val="19"/>
               </w:rPr>
-              <w:t>Formula: ((Impact × 0.6) + (Likelihood × 0.4)) / 5 × 25 pts</w:t>
+              <w:t>Formula: ((Impact×0.6)+(Likelihood×0.4))/5×25 pts</w:t>
               <w:br/>
-              <w:t>Fallback to static category weight if no Diligent match exists</w:t>
+              <w:t>Fallback to static category weight if no Diligent match</w:t>
             </w:r>
           </w:p>
         </w:tc>
@@ -569,9 +529,6 @@
             <w:vAlign w:val="center"/>
           </w:tcPr>
           <w:p>
-            <w:pPr>
-              <w:jc w:val="left"/>
-            </w:pPr>
             <w:r>
               <w:rPr>
                 <w:color w:val="2A3A50"/>
@@ -594,9 +551,6 @@
             <w:vAlign w:val="center"/>
           </w:tcPr>
           <w:p>
-            <w:pPr>
-              <w:jc w:val="left"/>
-            </w:pPr>
             <w:r>
               <w:rPr>
                 <w:color w:val="2A3A50"/>
@@ -619,9 +573,6 @@
             <w:vAlign w:val="center"/>
           </w:tcPr>
           <w:p>
-            <w:pPr>
-              <w:jc w:val="left"/>
-            </w:pPr>
             <w:r>
               <w:rPr>
                 <w:color w:val="2A3A50"/>
@@ -644,9 +595,6 @@
             <w:vAlign w:val="center"/>
           </w:tcPr>
           <w:p>
-            <w:pPr>
-              <w:jc w:val="left"/>
-            </w:pPr>
             <w:r>
               <w:rPr>
                 <w:color w:val="2A3A50"/>
@@ -671,9 +619,6 @@
             <w:vAlign w:val="center"/>
           </w:tcPr>
           <w:p>
-            <w:pPr>
-              <w:jc w:val="left"/>
-            </w:pPr>
             <w:r>
               <w:rPr>
                 <w:color w:val="2A3A50"/>
@@ -696,9 +641,6 @@
             <w:vAlign w:val="center"/>
           </w:tcPr>
           <w:p>
-            <w:pPr>
-              <w:jc w:val="left"/>
-            </w:pPr>
             <w:r>
               <w:rPr>
                 <w:color w:val="2A3A50"/>
@@ -721,9 +663,6 @@
             <w:vAlign w:val="center"/>
           </w:tcPr>
           <w:p>
-            <w:pPr>
-              <w:jc w:val="left"/>
-            </w:pPr>
             <w:r>
               <w:rPr>
                 <w:color w:val="2A3A50"/>
@@ -746,15 +685,12 @@
             <w:vAlign w:val="center"/>
           </w:tcPr>
           <w:p>
-            <w:pPr>
-              <w:jc w:val="left"/>
-            </w:pPr>
             <w:r>
               <w:rPr>
                 <w:color w:val="2A3A50"/>
                 <w:sz w:val="19"/>
               </w:rPr>
-              <w:t>Whether this risk type is covered in the historical records</w:t>
+              <w:t>Whether this risk type is covered in historical records</w:t>
             </w:r>
           </w:p>
         </w:tc>
@@ -768,7 +704,7 @@
           <w:color w:val="7A4400"/>
           <w:sz w:val="20"/>
         </w:rPr>
-        <w:t>Area Weight Formula (Diligent-Enhanced):</w:t>
+        <w:t>Area Weight Formula (Diligent-Enhanced)</w:t>
       </w:r>
     </w:p>
     <w:p>
@@ -794,7 +730,7 @@
           <w:color w:val="555555"/>
           <w:sz w:val="18"/>
         </w:rPr>
-        <w:t>Rating scale: High = 5,  Medium-High = 4,  Medium = 3,  Medium-Low = 2,  Low = 1</w:t>
+        <w:t>Rating scale: High=5, Medium-High=4, Medium=3, Medium-Low=2, Low=1</w:t>
       </w:r>
     </w:p>
     <w:p>
@@ -804,10 +740,10 @@
       <w:r>
         <w:rPr>
           <w:i/>
-          <w:color w:val="884400"/>
+          <w:color w:val="555555"/>
           <w:sz w:val="18"/>
         </w:rPr>
-        <w:t>No Diligent match → fallback to static category weight (observation is not penalized)</w:t>
+        <w:t>No Diligent match → fallback to static category weight (Science Laboratory uses fallback)</w:t>
       </w:r>
     </w:p>
     <w:p>
@@ -822,7 +758,7 @@
           <w:color w:val="1A3A5C"/>
           <w:sz w:val="26"/>
         </w:rPr>
-        <w:t>PART 2 — Risk-Based Audit Framework  (Issued Report Stage)</w:t>
+        <w:t>SECTION 2 — Risk-Based Audit Framework  (Issued Report Stage)</w:t>
       </w:r>
     </w:p>
     <w:p>
@@ -835,14 +771,15 @@
         <w:t>Purpose: Assigns the final impact rating to each observation in the issued audit report.</w:t>
       </w:r>
     </w:p>
+    <w:p/>
     <w:p>
       <w:r>
         <w:rPr>
           <w:b/>
           <w:color w:val="1A3A5C"/>
-          <w:sz w:val="20"/>
+          <w:sz w:val="22"/>
         </w:rPr>
-        <w:t>Data Sources (Part 2):</w:t>
+        <w:t>Data Sources (Part 2)</w:t>
       </w:r>
     </w:p>
     <w:p>
@@ -894,7 +831,7 @@
           <w:color w:val="1E5C3A"/>
           <w:sz w:val="19"/>
         </w:rPr>
-        <w:t>✔  Diligent Gap Analysis file — Impact &amp; Likelihood for matched risk (via SRR code)</w:t>
+        <w:t>✔  Diligent Gap Analysis file — Impact &amp; Likelihood matched via SRR code</w:t>
       </w:r>
     </w:p>
     <w:p>
@@ -918,31 +855,19 @@
           <w:color w:val="1A3A5C"/>
           <w:sz w:val="22"/>
         </w:rPr>
-        <w:t>A — System Recommendation Engine</w:t>
+        <w:t>A — System Recommendation Engine  (Score out of 100)</w:t>
       </w:r>
     </w:p>
-    <w:p>
-      <w:r>
-        <w:rPr>
-          <w:i/>
-          <w:color w:val="555555"/>
-          <w:sz w:val="19"/>
-        </w:rPr>
-        <w:t>System computes a recommended High / Medium / Low impact rating from three inputs and displays it with full breakdown so the auditor can see exactly what drove the suggestion.</w:t>
-      </w:r>
-    </w:p>
-    <w:p/>
     <w:tbl>
       <w:tblPr>
         <w:tblStyle w:val="TableGrid"/>
         <w:tblW w:type="auto" w:w="0"/>
-        <w:tblLayout w:type="fixed"/>
         <w:tblLook w:firstColumn="1" w:firstRow="1" w:lastColumn="0" w:lastRow="0" w:noHBand="0" w:noVBand="1" w:val="04A0"/>
       </w:tblPr>
       <w:tblGrid>
-        <w:gridCol w:w="2592"/>
-        <w:gridCol w:w="2880"/>
-        <w:gridCol w:w="4608"/>
+        <w:gridCol w:w="2304"/>
+        <w:gridCol w:w="1296"/>
+        <w:gridCol w:w="6480"/>
       </w:tblGrid>
       <w:tr>
         <w:tc>
@@ -967,7 +892,7 @@
                 <w:color w:val="FFFFFF"/>
                 <w:sz w:val="20"/>
               </w:rPr>
-              <w:t>Input</w:t>
+              <w:t>Signal</w:t>
             </w:r>
           </w:p>
         </w:tc>
@@ -993,7 +918,7 @@
                 <w:color w:val="FFFFFF"/>
                 <w:sz w:val="20"/>
               </w:rPr>
-              <w:t>Source</w:t>
+              <w:t>Max Score</w:t>
             </w:r>
           </w:p>
         </w:tc>
@@ -1038,163 +963,6 @@
             <w:vAlign w:val="center"/>
           </w:tcPr>
           <w:p>
-            <w:pPr>
-              <w:jc w:val="left"/>
-            </w:pPr>
-            <w:r>
-              <w:rPr>
-                <w:color w:val="2A3A50"/>
-                <w:sz w:val="19"/>
-              </w:rPr>
-              <w:t>Branch Historical Score</w:t>
-            </w:r>
-          </w:p>
-        </w:tc>
-        <w:tc>
-          <w:tcPr>
-            <w:tcW w:type="dxa" w:w="3120"/>
-            <w:shd w:val="clear" w:color="auto" w:fill="F5F8FC"/>
-            <w:tcBorders>
-              <w:top w:val="single" w:sz="4" w:color="B0C4DE"/>
-              <w:left w:val="single" w:sz="4" w:color="B0C4DE"/>
-              <w:bottom w:val="single" w:sz="4" w:color="B0C4DE"/>
-              <w:right w:val="single" w:sz="4" w:color="B0C4DE"/>
-            </w:tcBorders>
-            <w:vAlign w:val="center"/>
-          </w:tcPr>
-          <w:p>
-            <w:pPr>
-              <w:jc w:val="left"/>
-            </w:pPr>
-            <w:r>
-              <w:rPr>
-                <w:color w:val="2A3A50"/>
-                <w:sz w:val="19"/>
-              </w:rPr>
-              <w:t>Current branch uploaded files only</w:t>
-            </w:r>
-          </w:p>
-        </w:tc>
-        <w:tc>
-          <w:tcPr>
-            <w:tcW w:type="dxa" w:w="3120"/>
-            <w:shd w:val="clear" w:color="auto" w:fill="F5F8FC"/>
-            <w:tcBorders>
-              <w:top w:val="single" w:sz="4" w:color="B0C4DE"/>
-              <w:left w:val="single" w:sz="4" w:color="B0C4DE"/>
-              <w:bottom w:val="single" w:sz="4" w:color="B0C4DE"/>
-              <w:right w:val="single" w:sz="4" w:color="B0C4DE"/>
-            </w:tcBorders>
-            <w:vAlign w:val="center"/>
-          </w:tcPr>
-          <w:p>
-            <w:pPr>
-              <w:jc w:val="left"/>
-            </w:pPr>
-            <w:r>
-              <w:rPr>
-                <w:color w:val="2A3A50"/>
-                <w:sz w:val="19"/>
-              </w:rPr>
-              <w:t>Frequency &amp; repeat rate from this branch's own audit history — other branches excluded</w:t>
-            </w:r>
-          </w:p>
-        </w:tc>
-      </w:tr>
-      <w:tr>
-        <w:tc>
-          <w:tcPr>
-            <w:tcW w:type="dxa" w:w="3120"/>
-            <w:shd w:val="clear" w:color="auto" w:fill="EBF2FA"/>
-            <w:tcBorders>
-              <w:top w:val="single" w:sz="4" w:color="B0C4DE"/>
-              <w:left w:val="single" w:sz="4" w:color="B0C4DE"/>
-              <w:bottom w:val="single" w:sz="4" w:color="B0C4DE"/>
-              <w:right w:val="single" w:sz="4" w:color="B0C4DE"/>
-            </w:tcBorders>
-            <w:vAlign w:val="center"/>
-          </w:tcPr>
-          <w:p>
-            <w:pPr>
-              <w:jc w:val="left"/>
-            </w:pPr>
-            <w:r>
-              <w:rPr>
-                <w:color w:val="2A3A50"/>
-                <w:sz w:val="19"/>
-              </w:rPr>
-              <w:t>Diligent Impact &amp; Likelihood</w:t>
-            </w:r>
-          </w:p>
-        </w:tc>
-        <w:tc>
-          <w:tcPr>
-            <w:tcW w:type="dxa" w:w="3120"/>
-            <w:shd w:val="clear" w:color="auto" w:fill="EBF2FA"/>
-            <w:tcBorders>
-              <w:top w:val="single" w:sz="4" w:color="B0C4DE"/>
-              <w:left w:val="single" w:sz="4" w:color="B0C4DE"/>
-              <w:bottom w:val="single" w:sz="4" w:color="B0C4DE"/>
-              <w:right w:val="single" w:sz="4" w:color="B0C4DE"/>
-            </w:tcBorders>
-            <w:vAlign w:val="center"/>
-          </w:tcPr>
-          <w:p>
-            <w:pPr>
-              <w:jc w:val="left"/>
-            </w:pPr>
-            <w:r>
-              <w:rPr>
-                <w:color w:val="2A3A50"/>
-                <w:sz w:val="19"/>
-              </w:rPr>
-              <w:t>Gap analysis file, matched via SRR code</w:t>
-            </w:r>
-          </w:p>
-        </w:tc>
-        <w:tc>
-          <w:tcPr>
-            <w:tcW w:type="dxa" w:w="3120"/>
-            <w:shd w:val="clear" w:color="auto" w:fill="EBF2FA"/>
-            <w:tcBorders>
-              <w:top w:val="single" w:sz="4" w:color="B0C4DE"/>
-              <w:left w:val="single" w:sz="4" w:color="B0C4DE"/>
-              <w:bottom w:val="single" w:sz="4" w:color="B0C4DE"/>
-              <w:right w:val="single" w:sz="4" w:color="B0C4DE"/>
-            </w:tcBorders>
-            <w:vAlign w:val="center"/>
-          </w:tcPr>
-          <w:p>
-            <w:pPr>
-              <w:jc w:val="left"/>
-            </w:pPr>
-            <w:r>
-              <w:rPr>
-                <w:color w:val="2A3A50"/>
-                <w:sz w:val="19"/>
-              </w:rPr>
-              <w:t>Inherent risk level assigned by Diligent to the matched risk category. Formula: (Impact × 0.6 + Likelihood × 0.4) / 5</w:t>
-            </w:r>
-          </w:p>
-        </w:tc>
-      </w:tr>
-      <w:tr>
-        <w:tc>
-          <w:tcPr>
-            <w:tcW w:type="dxa" w:w="3120"/>
-            <w:shd w:val="clear" w:color="auto" w:fill="F5F8FC"/>
-            <w:tcBorders>
-              <w:top w:val="single" w:sz="4" w:color="B0C4DE"/>
-              <w:left w:val="single" w:sz="4" w:color="B0C4DE"/>
-              <w:bottom w:val="single" w:sz="4" w:color="B0C4DE"/>
-              <w:right w:val="single" w:sz="4" w:color="B0C4DE"/>
-            </w:tcBorders>
-            <w:vAlign w:val="center"/>
-          </w:tcPr>
-          <w:p>
-            <w:pPr>
-              <w:jc w:val="left"/>
-            </w:pPr>
             <w:r>
               <w:rPr>
                 <w:color w:val="2A3A50"/>
@@ -1217,15 +985,12 @@
             <w:vAlign w:val="center"/>
           </w:tcPr>
           <w:p>
-            <w:pPr>
-              <w:jc w:val="left"/>
-            </w:pPr>
             <w:r>
               <w:rPr>
                 <w:color w:val="2A3A50"/>
                 <w:sz w:val="19"/>
               </w:rPr>
-              <w:t>Auditor-entered data per observation</w:t>
+              <w:t>40 pts</w:t>
             </w:r>
           </w:p>
         </w:tc>
@@ -1242,20 +1007,166 @@
             <w:vAlign w:val="center"/>
           </w:tcPr>
           <w:p>
-            <w:pPr>
-              <w:jc w:val="left"/>
-            </w:pPr>
             <w:r>
               <w:rPr>
                 <w:color w:val="2A3A50"/>
                 <w:sz w:val="19"/>
               </w:rPr>
-              <w:t>Instances count + Financial Impact amount entered in the materiality section of each observation</w:t>
+              <w:t>Instances count (max 25) + Financial Impact Rs. (max 15). Entered by auditor in the materiality section of each observation.</w:t>
+            </w:r>
+          </w:p>
+        </w:tc>
+      </w:tr>
+      <w:tr>
+        <w:tc>
+          <w:tcPr>
+            <w:tcW w:type="dxa" w:w="3120"/>
+            <w:shd w:val="clear" w:color="auto" w:fill="EBF2FA"/>
+            <w:tcBorders>
+              <w:top w:val="single" w:sz="4" w:color="B0C4DE"/>
+              <w:left w:val="single" w:sz="4" w:color="B0C4DE"/>
+              <w:bottom w:val="single" w:sz="4" w:color="B0C4DE"/>
+              <w:right w:val="single" w:sz="4" w:color="B0C4DE"/>
+            </w:tcBorders>
+            <w:vAlign w:val="center"/>
+          </w:tcPr>
+          <w:p>
+            <w:r>
+              <w:rPr>
+                <w:color w:val="2A3A50"/>
+                <w:sz w:val="19"/>
+              </w:rPr>
+              <w:t>Branch History</w:t>
+            </w:r>
+          </w:p>
+        </w:tc>
+        <w:tc>
+          <w:tcPr>
+            <w:tcW w:type="dxa" w:w="3120"/>
+            <w:shd w:val="clear" w:color="auto" w:fill="EBF2FA"/>
+            <w:tcBorders>
+              <w:top w:val="single" w:sz="4" w:color="B0C4DE"/>
+              <w:left w:val="single" w:sz="4" w:color="B0C4DE"/>
+              <w:bottom w:val="single" w:sz="4" w:color="B0C4DE"/>
+              <w:right w:val="single" w:sz="4" w:color="B0C4DE"/>
+            </w:tcBorders>
+            <w:vAlign w:val="center"/>
+          </w:tcPr>
+          <w:p>
+            <w:r>
+              <w:rPr>
+                <w:color w:val="2A3A50"/>
+                <w:sz w:val="19"/>
+              </w:rPr>
+              <w:t>30 pts</w:t>
+            </w:r>
+          </w:p>
+        </w:tc>
+        <w:tc>
+          <w:tcPr>
+            <w:tcW w:type="dxa" w:w="3120"/>
+            <w:shd w:val="clear" w:color="auto" w:fill="EBF2FA"/>
+            <w:tcBorders>
+              <w:top w:val="single" w:sz="4" w:color="B0C4DE"/>
+              <w:left w:val="single" w:sz="4" w:color="B0C4DE"/>
+              <w:bottom w:val="single" w:sz="4" w:color="B0C4DE"/>
+              <w:right w:val="single" w:sz="4" w:color="B0C4DE"/>
+            </w:tcBorders>
+            <w:vAlign w:val="center"/>
+          </w:tcPr>
+          <w:p>
+            <w:r>
+              <w:rPr>
+                <w:color w:val="2A3A50"/>
+                <w:sz w:val="19"/>
+              </w:rPr>
+              <w:t>Frequency and repeat rate from current branch's own uploaded files only. Other branches excluded at this stage.</w:t>
+            </w:r>
+          </w:p>
+        </w:tc>
+      </w:tr>
+      <w:tr>
+        <w:tc>
+          <w:tcPr>
+            <w:tcW w:type="dxa" w:w="3120"/>
+            <w:shd w:val="clear" w:color="auto" w:fill="F5F8FC"/>
+            <w:tcBorders>
+              <w:top w:val="single" w:sz="4" w:color="B0C4DE"/>
+              <w:left w:val="single" w:sz="4" w:color="B0C4DE"/>
+              <w:bottom w:val="single" w:sz="4" w:color="B0C4DE"/>
+              <w:right w:val="single" w:sz="4" w:color="B0C4DE"/>
+            </w:tcBorders>
+            <w:vAlign w:val="center"/>
+          </w:tcPr>
+          <w:p>
+            <w:r>
+              <w:rPr>
+                <w:color w:val="2A3A50"/>
+                <w:sz w:val="19"/>
+              </w:rPr>
+              <w:t>Diligent Impact &amp; Likelihood</w:t>
+            </w:r>
+          </w:p>
+        </w:tc>
+        <w:tc>
+          <w:tcPr>
+            <w:tcW w:type="dxa" w:w="3120"/>
+            <w:shd w:val="clear" w:color="auto" w:fill="F5F8FC"/>
+            <w:tcBorders>
+              <w:top w:val="single" w:sz="4" w:color="B0C4DE"/>
+              <w:left w:val="single" w:sz="4" w:color="B0C4DE"/>
+              <w:bottom w:val="single" w:sz="4" w:color="B0C4DE"/>
+              <w:right w:val="single" w:sz="4" w:color="B0C4DE"/>
+            </w:tcBorders>
+            <w:vAlign w:val="center"/>
+          </w:tcPr>
+          <w:p>
+            <w:r>
+              <w:rPr>
+                <w:color w:val="2A3A50"/>
+                <w:sz w:val="19"/>
+              </w:rPr>
+              <w:t>30 pts</w:t>
+            </w:r>
+          </w:p>
+        </w:tc>
+        <w:tc>
+          <w:tcPr>
+            <w:tcW w:type="dxa" w:w="3120"/>
+            <w:shd w:val="clear" w:color="auto" w:fill="F5F8FC"/>
+            <w:tcBorders>
+              <w:top w:val="single" w:sz="4" w:color="B0C4DE"/>
+              <w:left w:val="single" w:sz="4" w:color="B0C4DE"/>
+              <w:bottom w:val="single" w:sz="4" w:color="B0C4DE"/>
+              <w:right w:val="single" w:sz="4" w:color="B0C4DE"/>
+            </w:tcBorders>
+            <w:vAlign w:val="center"/>
+          </w:tcPr>
+          <w:p>
+            <w:r>
+              <w:rPr>
+                <w:color w:val="2A3A50"/>
+                <w:sz w:val="19"/>
+              </w:rPr>
+              <w:t>avgImpact × 0.6 + avgLikelihood × 0.4, from gap analysis file matched via SRR code for the observation category.</w:t>
             </w:r>
           </w:p>
         </w:tc>
       </w:tr>
     </w:tbl>
+    <w:p>
+      <w:pPr>
+        <w:ind w:left="432"/>
+      </w:pPr>
+      <w:r>
+        <w:rPr>
+          <w:b/>
+          <w:color w:val="1A3A5C"/>
+          <w:sz w:val="19"/>
+        </w:rPr>
+        <w:t>Score thresholds:  ≥ 70 = High    ≥ 45 = M to H    ≥ 20 = L to M    &gt; 0 = Low</w:t>
+      </w:r>
+    </w:p>
     <w:p/>
     <w:p>
       <w:r>
@@ -1267,17 +1178,288 @@
         <w:t>B — Auditor Final Judgment</w:t>
       </w:r>
     </w:p>
+    <w:p>
+      <w:r>
+        <w:rPr>
+          <w:i/>
+          <w:color w:val="555555"/>
+          <w:sz w:val="19"/>
+        </w:rPr>
+        <w:t>One input only — the Sensitivity combo box (top-right of each observation). Auditor accepts or overrides system recommendation.</w:t>
+      </w:r>
+    </w:p>
     <w:tbl>
       <w:tblPr>
         <w:tblStyle w:val="TableGrid"/>
         <w:tblW w:type="auto" w:w="0"/>
-        <w:tblLayout w:type="fixed"/>
         <w:tblLook w:firstColumn="1" w:firstRow="1" w:lastColumn="0" w:lastRow="0" w:noHBand="0" w:noVBand="1" w:val="04A0"/>
       </w:tblPr>
       <w:tblGrid>
-        <w:gridCol w:w="2592"/>
+        <w:gridCol w:w="3600"/>
+        <w:gridCol w:w="6480"/>
+      </w:tblGrid>
+      <w:tr>
+        <w:tc>
+          <w:tcPr>
+            <w:tcW w:type="dxa" w:w="4680"/>
+            <w:shd w:val="clear" w:color="auto" w:fill="1A3A5C"/>
+            <w:tcBorders>
+              <w:top w:val="single" w:sz="4" w:color="B0C4DE"/>
+              <w:left w:val="single" w:sz="4" w:color="B0C4DE"/>
+              <w:bottom w:val="single" w:sz="4" w:color="B0C4DE"/>
+              <w:right w:val="single" w:sz="4" w:color="B0C4DE"/>
+            </w:tcBorders>
+            <w:vAlign w:val="center"/>
+          </w:tcPr>
+          <w:p>
+            <w:pPr>
+              <w:jc w:val="center"/>
+            </w:pPr>
+            <w:r>
+              <w:rPr>
+                <w:b/>
+                <w:color w:val="FFFFFF"/>
+                <w:sz w:val="20"/>
+              </w:rPr>
+              <w:t>State</w:t>
+            </w:r>
+          </w:p>
+        </w:tc>
+        <w:tc>
+          <w:tcPr>
+            <w:tcW w:type="dxa" w:w="4680"/>
+            <w:shd w:val="clear" w:color="auto" w:fill="1A3A5C"/>
+            <w:tcBorders>
+              <w:top w:val="single" w:sz="4" w:color="B0C4DE"/>
+              <w:left w:val="single" w:sz="4" w:color="B0C4DE"/>
+              <w:bottom w:val="single" w:sz="4" w:color="B0C4DE"/>
+              <w:right w:val="single" w:sz="4" w:color="B0C4DE"/>
+            </w:tcBorders>
+            <w:vAlign w:val="center"/>
+          </w:tcPr>
+          <w:p>
+            <w:pPr>
+              <w:jc w:val="center"/>
+            </w:pPr>
+            <w:r>
+              <w:rPr>
+                <w:b/>
+                <w:color w:val="FFFFFF"/>
+                <w:sz w:val="20"/>
+              </w:rPr>
+              <w:t>Meaning</w:t>
+            </w:r>
+          </w:p>
+        </w:tc>
+      </w:tr>
+      <w:tr>
+        <w:tc>
+          <w:tcPr>
+            <w:tcW w:type="dxa" w:w="4680"/>
+            <w:shd w:val="clear" w:color="auto" w:fill="EBF2FA"/>
+            <w:tcBorders>
+              <w:top w:val="single" w:sz="4" w:color="B0C4DE"/>
+              <w:left w:val="single" w:sz="4" w:color="B0C4DE"/>
+              <w:bottom w:val="single" w:sz="4" w:color="B0C4DE"/>
+              <w:right w:val="single" w:sz="4" w:color="B0C4DE"/>
+            </w:tcBorders>
+            <w:vAlign w:val="center"/>
+          </w:tcPr>
+          <w:p>
+            <w:r>
+              <w:rPr>
+                <w:color w:val="2A3A50"/>
+                <w:sz w:val="19"/>
+              </w:rPr>
+              <w:t>System Suggested (default)</w:t>
+            </w:r>
+          </w:p>
+        </w:tc>
+        <w:tc>
+          <w:tcPr>
+            <w:tcW w:type="dxa" w:w="4680"/>
+            <w:shd w:val="clear" w:color="auto" w:fill="EBF2FA"/>
+            <w:tcBorders>
+              <w:top w:val="single" w:sz="4" w:color="B0C4DE"/>
+              <w:left w:val="single" w:sz="4" w:color="B0C4DE"/>
+              <w:bottom w:val="single" w:sz="4" w:color="B0C4DE"/>
+              <w:right w:val="single" w:sz="4" w:color="B0C4DE"/>
+            </w:tcBorders>
+            <w:vAlign w:val="center"/>
+          </w:tcPr>
+          <w:p>
+            <w:r>
+              <w:rPr>
+                <w:color w:val="2A3A50"/>
+                <w:sz w:val="19"/>
+              </w:rPr>
+              <w:t>Combo box shows system recommendation. Marked with ⓘ and score breakdown on hover.</w:t>
+            </w:r>
+          </w:p>
+        </w:tc>
+      </w:tr>
+      <w:tr>
+        <w:tc>
+          <w:tcPr>
+            <w:tcW w:type="dxa" w:w="4680"/>
+            <w:shd w:val="clear" w:color="auto" w:fill="E8F8F0"/>
+            <w:tcBorders>
+              <w:top w:val="single" w:sz="4" w:color="B0C4DE"/>
+              <w:left w:val="single" w:sz="4" w:color="B0C4DE"/>
+              <w:bottom w:val="single" w:sz="4" w:color="B0C4DE"/>
+              <w:right w:val="single" w:sz="4" w:color="B0C4DE"/>
+            </w:tcBorders>
+            <w:vAlign w:val="center"/>
+          </w:tcPr>
+          <w:p>
+            <w:r>
+              <w:rPr>
+                <w:color w:val="2A3A50"/>
+                <w:sz w:val="19"/>
+              </w:rPr>
+              <w:t>Auditor Confirmed</w:t>
+            </w:r>
+          </w:p>
+        </w:tc>
+        <w:tc>
+          <w:tcPr>
+            <w:tcW w:type="dxa" w:w="4680"/>
+            <w:shd w:val="clear" w:color="auto" w:fill="E8F8F0"/>
+            <w:tcBorders>
+              <w:top w:val="single" w:sz="4" w:color="B0C4DE"/>
+              <w:left w:val="single" w:sz="4" w:color="B0C4DE"/>
+              <w:bottom w:val="single" w:sz="4" w:color="B0C4DE"/>
+              <w:right w:val="single" w:sz="4" w:color="B0C4DE"/>
+            </w:tcBorders>
+            <w:vAlign w:val="center"/>
+          </w:tcPr>
+          <w:p>
+            <w:r>
+              <w:rPr>
+                <w:color w:val="2A3A50"/>
+                <w:sz w:val="19"/>
+              </w:rPr>
+              <w:t>Auditor accepted or overridden. Confirmation prompt shown before locking. Override logged to Audit Trail.</w:t>
+            </w:r>
+          </w:p>
+        </w:tc>
+      </w:tr>
+    </w:tbl>
+    <w:p>
+      <w:r>
+        <w:br w:type="page"/>
+      </w:r>
+    </w:p>
+    <w:p>
+      <w:r>
+        <w:rPr>
+          <w:b/>
+          <w:color w:val="1A3A5C"/>
+          <w:sz w:val="26"/>
+        </w:rPr>
+        <w:t>SECTION 3 — Multi-Stage Report Review Workflow</w:t>
+      </w:r>
+    </w:p>
+    <w:p>
+      <w:r>
+        <w:rPr>
+          <w:i/>
+          <w:color w:val="555555"/>
+          <w:sz w:val="19"/>
+        </w:rPr>
+        <w:t>Purpose: Governs how the audit report moves from Auditor through RO Manager to HO before issuance.</w:t>
+      </w:r>
+    </w:p>
+    <w:p/>
+    <w:p>
+      <w:r>
+        <w:rPr>
+          <w:b/>
+          <w:color w:val="1A3A5C"/>
+          <w:sz w:val="22"/>
+        </w:rPr>
+        <w:t>Workflow Overview</w:t>
+      </w:r>
+    </w:p>
+    <w:p>
+      <w:r>
+        <w:rPr>
+          <w:rFonts w:ascii="Courier New" w:hAnsi="Courier New"/>
+          <w:color w:val="1A3A5C"/>
+          <w:sz w:val="17"/>
+        </w:rPr>
+        <w:t>Auditor (Draft)</w:t>
+        <w:br/>
+        <w:t xml:space="preserve">    │</w:t>
+        <w:br/>
+        <w:t xml:space="preserve">    ├──→ Auditee Soft Copy → Branch fills responses → Auditor loads back (branch response locked)</w:t>
+        <w:br/>
+        <w:t xml:space="preserve">    ├── Auditor fills RO/HO management response fields</w:t>
+        <w:br/>
+        <w:t xml:space="preserve">    └── Saves session → generates "Send to RO" file (Option A: single self-contained file)</w:t>
+        <w:br/>
+        <w:t xml:space="preserve">         │</w:t>
+        <w:br/>
+        <w:t xml:space="preserve">         ▼</w:t>
+        <w:br/>
+        <w:t>RO Manager Review  [Stage: ro_review]</w:t>
+        <w:br/>
+        <w:t xml:space="preserve">    │</w:t>
+        <w:br/>
+        <w:t xml:space="preserve">    ├── Reviews observations, wording changes, Audit Trail</w:t>
+        <w:br/>
+        <w:t xml:space="preserve">    ├── Can amend auditee responses (with mandatory documentary evidence attachment)</w:t>
+        <w:br/>
+        <w:t xml:space="preserve">    ├──→ SEND BACK to Auditor  [Stage: sent_back_to_auditor]</w:t>
+        <w:br/>
+        <w:t xml:space="preserve">    │         Auditor sees only flagged items + RO comments → corrects → re-submits</w:t>
+        <w:br/>
+        <w:t xml:space="preserve">    │         RO re-opens → sees original comment + auditor correction side by side</w:t>
+        <w:br/>
+        <w:t xml:space="preserve">    └──→ Forward to HO  [Stage: ho_review]</w:t>
+        <w:br/>
+        <w:t xml:space="preserve">         │</w:t>
+        <w:br/>
+        <w:t xml:space="preserve">         ▼</w:t>
+        <w:br/>
+        <w:t>HO Final Review  [Stage: ho_review]</w:t>
+        <w:br/>
+        <w:t xml:space="preserve">    │</w:t>
+        <w:br/>
+        <w:t xml:space="preserve">    ├── Sees wording changes summary (expandable), full Audit Trail</w:t>
+        <w:br/>
+        <w:t xml:space="preserve">    ├── Can amend auditee responses (with mandatory documentary evidence attachment)</w:t>
+        <w:br/>
+        <w:t xml:space="preserve">    ├──→ SEND BACK to RO  [Stage: sent_back_to_ro]</w:t>
+        <w:br/>
+        <w:t xml:space="preserve">    │         RO sees only HO-flagged items + HO comments → corrects → re-submits</w:t>
+        <w:br/>
+        <w:t xml:space="preserve">    │         HO re-opens → sees original HO comment + RO correction side by side</w:t>
+        <w:br/>
+        <w:t xml:space="preserve">    └──→ Issue Report  [Stage: issued]</w:t>
+      </w:r>
+    </w:p>
+    <w:p/>
+    <w:p>
+      <w:r>
+        <w:rPr>
+          <w:b/>
+          <w:color w:val="1A3A5C"/>
+          <w:sz w:val="22"/>
+        </w:rPr>
+        <w:t>Stage Flags</w:t>
+      </w:r>
+    </w:p>
+    <w:tbl>
+      <w:tblPr>
+        <w:tblStyle w:val="TableGrid"/>
+        <w:tblW w:type="auto" w:w="0"/>
+        <w:tblLook w:firstColumn="1" w:firstRow="1" w:lastColumn="0" w:lastRow="0" w:noHBand="0" w:noVBand="1" w:val="04A0"/>
+      </w:tblPr>
+      <w:tblGrid>
+        <w:gridCol w:w="3168"/>
         <w:gridCol w:w="2880"/>
-        <w:gridCol w:w="4608"/>
+        <w:gridCol w:w="4032"/>
       </w:tblGrid>
       <w:tr>
         <w:tc>
@@ -1302,7 +1484,7 @@
                 <w:color w:val="FFFFFF"/>
                 <w:sz w:val="20"/>
               </w:rPr>
-              <w:t>Input</w:t>
+              <w:t>reportStage Value</w:t>
             </w:r>
           </w:p>
         </w:tc>
@@ -1328,7 +1510,7 @@
                 <w:color w:val="FFFFFF"/>
                 <w:sz w:val="20"/>
               </w:rPr>
-              <w:t>Source</w:t>
+              <w:t>Who Sees It</w:t>
             </w:r>
           </w:p>
         </w:tc>
@@ -1354,7 +1536,7 @@
                 <w:color w:val="FFFFFF"/>
                 <w:sz w:val="20"/>
               </w:rPr>
-              <w:t>Detail</w:t>
+              <w:t>Interface</w:t>
             </w:r>
           </w:p>
         </w:tc>
@@ -1363,7 +1545,443 @@
         <w:tc>
           <w:tcPr>
             <w:tcW w:type="dxa" w:w="3120"/>
-            <w:shd w:val="clear" w:color="auto" w:fill="E8F8F0"/>
+            <w:shd w:val="clear" w:color="auto" w:fill="F5F8FC"/>
+            <w:tcBorders>
+              <w:top w:val="single" w:sz="4" w:color="B0C4DE"/>
+              <w:left w:val="single" w:sz="4" w:color="B0C4DE"/>
+              <w:bottom w:val="single" w:sz="4" w:color="B0C4DE"/>
+              <w:right w:val="single" w:sz="4" w:color="B0C4DE"/>
+            </w:tcBorders>
+            <w:vAlign w:val="center"/>
+          </w:tcPr>
+          <w:p>
+            <w:r>
+              <w:rPr>
+                <w:color w:val="2A3A50"/>
+                <w:sz w:val="19"/>
+              </w:rPr>
+              <w:t>draft</w:t>
+            </w:r>
+          </w:p>
+        </w:tc>
+        <w:tc>
+          <w:tcPr>
+            <w:tcW w:type="dxa" w:w="3120"/>
+            <w:shd w:val="clear" w:color="auto" w:fill="F5F8FC"/>
+            <w:tcBorders>
+              <w:top w:val="single" w:sz="4" w:color="B0C4DE"/>
+              <w:left w:val="single" w:sz="4" w:color="B0C4DE"/>
+              <w:bottom w:val="single" w:sz="4" w:color="B0C4DE"/>
+              <w:right w:val="single" w:sz="4" w:color="B0C4DE"/>
+            </w:tcBorders>
+            <w:vAlign w:val="center"/>
+          </w:tcPr>
+          <w:p>
+            <w:r>
+              <w:rPr>
+                <w:color w:val="2A3A50"/>
+                <w:sz w:val="19"/>
+              </w:rPr>
+              <w:t>Auditor</w:t>
+            </w:r>
+          </w:p>
+        </w:tc>
+        <w:tc>
+          <w:tcPr>
+            <w:tcW w:type="dxa" w:w="3120"/>
+            <w:shd w:val="clear" w:color="auto" w:fill="F5F8FC"/>
+            <w:tcBorders>
+              <w:top w:val="single" w:sz="4" w:color="B0C4DE"/>
+              <w:left w:val="single" w:sz="4" w:color="B0C4DE"/>
+              <w:bottom w:val="single" w:sz="4" w:color="B0C4DE"/>
+              <w:right w:val="single" w:sz="4" w:color="B0C4DE"/>
+            </w:tcBorders>
+            <w:vAlign w:val="center"/>
+          </w:tcPr>
+          <w:p>
+            <w:r>
+              <w:rPr>
+                <w:color w:val="2A3A50"/>
+                <w:sz w:val="19"/>
+              </w:rPr>
+              <w:t>Full editing tools — all features enabled</w:t>
+            </w:r>
+          </w:p>
+        </w:tc>
+      </w:tr>
+      <w:tr>
+        <w:tc>
+          <w:tcPr>
+            <w:tcW w:type="dxa" w:w="3120"/>
+            <w:shd w:val="clear" w:color="auto" w:fill="EBF2FA"/>
+            <w:tcBorders>
+              <w:top w:val="single" w:sz="4" w:color="B0C4DE"/>
+              <w:left w:val="single" w:sz="4" w:color="B0C4DE"/>
+              <w:bottom w:val="single" w:sz="4" w:color="B0C4DE"/>
+              <w:right w:val="single" w:sz="4" w:color="B0C4DE"/>
+            </w:tcBorders>
+            <w:vAlign w:val="center"/>
+          </w:tcPr>
+          <w:p>
+            <w:r>
+              <w:rPr>
+                <w:color w:val="2A3A50"/>
+                <w:sz w:val="19"/>
+              </w:rPr>
+              <w:t>ro_review</w:t>
+            </w:r>
+          </w:p>
+        </w:tc>
+        <w:tc>
+          <w:tcPr>
+            <w:tcW w:type="dxa" w:w="3120"/>
+            <w:shd w:val="clear" w:color="auto" w:fill="EBF2FA"/>
+            <w:tcBorders>
+              <w:top w:val="single" w:sz="4" w:color="B0C4DE"/>
+              <w:left w:val="single" w:sz="4" w:color="B0C4DE"/>
+              <w:bottom w:val="single" w:sz="4" w:color="B0C4DE"/>
+              <w:right w:val="single" w:sz="4" w:color="B0C4DE"/>
+            </w:tcBorders>
+            <w:vAlign w:val="center"/>
+          </w:tcPr>
+          <w:p>
+            <w:r>
+              <w:rPr>
+                <w:color w:val="2A3A50"/>
+                <w:sz w:val="19"/>
+              </w:rPr>
+              <w:t>RO Manager</w:t>
+            </w:r>
+          </w:p>
+        </w:tc>
+        <w:tc>
+          <w:tcPr>
+            <w:tcW w:type="dxa" w:w="3120"/>
+            <w:shd w:val="clear" w:color="auto" w:fill="EBF2FA"/>
+            <w:tcBorders>
+              <w:top w:val="single" w:sz="4" w:color="B0C4DE"/>
+              <w:left w:val="single" w:sz="4" w:color="B0C4DE"/>
+              <w:bottom w:val="single" w:sz="4" w:color="B0C4DE"/>
+              <w:right w:val="single" w:sz="4" w:color="B0C4DE"/>
+            </w:tcBorders>
+            <w:vAlign w:val="center"/>
+          </w:tcPr>
+          <w:p>
+            <w:r>
+              <w:rPr>
+                <w:color w:val="2A3A50"/>
+                <w:sz w:val="19"/>
+              </w:rPr>
+              <w:t>Review only — flag, comment, accept/decline, amend response, send back or forward</w:t>
+            </w:r>
+          </w:p>
+        </w:tc>
+      </w:tr>
+      <w:tr>
+        <w:tc>
+          <w:tcPr>
+            <w:tcW w:type="dxa" w:w="3120"/>
+            <w:shd w:val="clear" w:color="auto" w:fill="F5F8FC"/>
+            <w:tcBorders>
+              <w:top w:val="single" w:sz="4" w:color="B0C4DE"/>
+              <w:left w:val="single" w:sz="4" w:color="B0C4DE"/>
+              <w:bottom w:val="single" w:sz="4" w:color="B0C4DE"/>
+              <w:right w:val="single" w:sz="4" w:color="B0C4DE"/>
+            </w:tcBorders>
+            <w:vAlign w:val="center"/>
+          </w:tcPr>
+          <w:p>
+            <w:r>
+              <w:rPr>
+                <w:color w:val="2A3A50"/>
+                <w:sz w:val="19"/>
+              </w:rPr>
+              <w:t>sent_back_to_auditor</w:t>
+            </w:r>
+          </w:p>
+        </w:tc>
+        <w:tc>
+          <w:tcPr>
+            <w:tcW w:type="dxa" w:w="3120"/>
+            <w:shd w:val="clear" w:color="auto" w:fill="F5F8FC"/>
+            <w:tcBorders>
+              <w:top w:val="single" w:sz="4" w:color="B0C4DE"/>
+              <w:left w:val="single" w:sz="4" w:color="B0C4DE"/>
+              <w:bottom w:val="single" w:sz="4" w:color="B0C4DE"/>
+              <w:right w:val="single" w:sz="4" w:color="B0C4DE"/>
+            </w:tcBorders>
+            <w:vAlign w:val="center"/>
+          </w:tcPr>
+          <w:p>
+            <w:r>
+              <w:rPr>
+                <w:color w:val="2A3A50"/>
+                <w:sz w:val="19"/>
+              </w:rPr>
+              <w:t>Auditor</w:t>
+            </w:r>
+          </w:p>
+        </w:tc>
+        <w:tc>
+          <w:tcPr>
+            <w:tcW w:type="dxa" w:w="3120"/>
+            <w:shd w:val="clear" w:color="auto" w:fill="F5F8FC"/>
+            <w:tcBorders>
+              <w:top w:val="single" w:sz="4" w:color="B0C4DE"/>
+              <w:left w:val="single" w:sz="4" w:color="B0C4DE"/>
+              <w:bottom w:val="single" w:sz="4" w:color="B0C4DE"/>
+              <w:right w:val="single" w:sz="4" w:color="B0C4DE"/>
+            </w:tcBorders>
+            <w:vAlign w:val="center"/>
+          </w:tcPr>
+          <w:p>
+            <w:r>
+              <w:rPr>
+                <w:color w:val="2A3A50"/>
+                <w:sz w:val="19"/>
+              </w:rPr>
+              <w:t>Only flagged observations highlighted in red with RO comments visible</w:t>
+            </w:r>
+          </w:p>
+        </w:tc>
+      </w:tr>
+      <w:tr>
+        <w:tc>
+          <w:tcPr>
+            <w:tcW w:type="dxa" w:w="3120"/>
+            <w:shd w:val="clear" w:color="auto" w:fill="EBF2FA"/>
+            <w:tcBorders>
+              <w:top w:val="single" w:sz="4" w:color="B0C4DE"/>
+              <w:left w:val="single" w:sz="4" w:color="B0C4DE"/>
+              <w:bottom w:val="single" w:sz="4" w:color="B0C4DE"/>
+              <w:right w:val="single" w:sz="4" w:color="B0C4DE"/>
+            </w:tcBorders>
+            <w:vAlign w:val="center"/>
+          </w:tcPr>
+          <w:p>
+            <w:r>
+              <w:rPr>
+                <w:color w:val="2A3A50"/>
+                <w:sz w:val="19"/>
+              </w:rPr>
+              <w:t>ho_review</w:t>
+            </w:r>
+          </w:p>
+        </w:tc>
+        <w:tc>
+          <w:tcPr>
+            <w:tcW w:type="dxa" w:w="3120"/>
+            <w:shd w:val="clear" w:color="auto" w:fill="EBF2FA"/>
+            <w:tcBorders>
+              <w:top w:val="single" w:sz="4" w:color="B0C4DE"/>
+              <w:left w:val="single" w:sz="4" w:color="B0C4DE"/>
+              <w:bottom w:val="single" w:sz="4" w:color="B0C4DE"/>
+              <w:right w:val="single" w:sz="4" w:color="B0C4DE"/>
+            </w:tcBorders>
+            <w:vAlign w:val="center"/>
+          </w:tcPr>
+          <w:p>
+            <w:r>
+              <w:rPr>
+                <w:color w:val="2A3A50"/>
+                <w:sz w:val="19"/>
+              </w:rPr>
+              <w:t>HO</w:t>
+            </w:r>
+          </w:p>
+        </w:tc>
+        <w:tc>
+          <w:tcPr>
+            <w:tcW w:type="dxa" w:w="3120"/>
+            <w:shd w:val="clear" w:color="auto" w:fill="EBF2FA"/>
+            <w:tcBorders>
+              <w:top w:val="single" w:sz="4" w:color="B0C4DE"/>
+              <w:left w:val="single" w:sz="4" w:color="B0C4DE"/>
+              <w:bottom w:val="single" w:sz="4" w:color="B0C4DE"/>
+              <w:right w:val="single" w:sz="4" w:color="B0C4DE"/>
+            </w:tcBorders>
+            <w:vAlign w:val="center"/>
+          </w:tcPr>
+          <w:p>
+            <w:r>
+              <w:rPr>
+                <w:color w:val="2A3A50"/>
+                <w:sz w:val="19"/>
+              </w:rPr>
+              <w:t>Review only — same as RO but with final issuance authority</w:t>
+            </w:r>
+          </w:p>
+        </w:tc>
+      </w:tr>
+      <w:tr>
+        <w:tc>
+          <w:tcPr>
+            <w:tcW w:type="dxa" w:w="3120"/>
+            <w:shd w:val="clear" w:color="auto" w:fill="F5F8FC"/>
+            <w:tcBorders>
+              <w:top w:val="single" w:sz="4" w:color="B0C4DE"/>
+              <w:left w:val="single" w:sz="4" w:color="B0C4DE"/>
+              <w:bottom w:val="single" w:sz="4" w:color="B0C4DE"/>
+              <w:right w:val="single" w:sz="4" w:color="B0C4DE"/>
+            </w:tcBorders>
+            <w:vAlign w:val="center"/>
+          </w:tcPr>
+          <w:p>
+            <w:r>
+              <w:rPr>
+                <w:color w:val="2A3A50"/>
+                <w:sz w:val="19"/>
+              </w:rPr>
+              <w:t>sent_back_to_ro</w:t>
+            </w:r>
+          </w:p>
+        </w:tc>
+        <w:tc>
+          <w:tcPr>
+            <w:tcW w:type="dxa" w:w="3120"/>
+            <w:shd w:val="clear" w:color="auto" w:fill="F5F8FC"/>
+            <w:tcBorders>
+              <w:top w:val="single" w:sz="4" w:color="B0C4DE"/>
+              <w:left w:val="single" w:sz="4" w:color="B0C4DE"/>
+              <w:bottom w:val="single" w:sz="4" w:color="B0C4DE"/>
+              <w:right w:val="single" w:sz="4" w:color="B0C4DE"/>
+            </w:tcBorders>
+            <w:vAlign w:val="center"/>
+          </w:tcPr>
+          <w:p>
+            <w:r>
+              <w:rPr>
+                <w:color w:val="2A3A50"/>
+                <w:sz w:val="19"/>
+              </w:rPr>
+              <w:t>RO Manager</w:t>
+            </w:r>
+          </w:p>
+        </w:tc>
+        <w:tc>
+          <w:tcPr>
+            <w:tcW w:type="dxa" w:w="3120"/>
+            <w:shd w:val="clear" w:color="auto" w:fill="F5F8FC"/>
+            <w:tcBorders>
+              <w:top w:val="single" w:sz="4" w:color="B0C4DE"/>
+              <w:left w:val="single" w:sz="4" w:color="B0C4DE"/>
+              <w:bottom w:val="single" w:sz="4" w:color="B0C4DE"/>
+              <w:right w:val="single" w:sz="4" w:color="B0C4DE"/>
+            </w:tcBorders>
+            <w:vAlign w:val="center"/>
+          </w:tcPr>
+          <w:p>
+            <w:r>
+              <w:rPr>
+                <w:color w:val="2A3A50"/>
+                <w:sz w:val="19"/>
+              </w:rPr>
+              <w:t>Only HO-flagged observations highlighted with HO comments visible</w:t>
+            </w:r>
+          </w:p>
+        </w:tc>
+      </w:tr>
+      <w:tr>
+        <w:tc>
+          <w:tcPr>
+            <w:tcW w:type="dxa" w:w="3120"/>
+            <w:shd w:val="clear" w:color="auto" w:fill="EBF2FA"/>
+            <w:tcBorders>
+              <w:top w:val="single" w:sz="4" w:color="B0C4DE"/>
+              <w:left w:val="single" w:sz="4" w:color="B0C4DE"/>
+              <w:bottom w:val="single" w:sz="4" w:color="B0C4DE"/>
+              <w:right w:val="single" w:sz="4" w:color="B0C4DE"/>
+            </w:tcBorders>
+            <w:vAlign w:val="center"/>
+          </w:tcPr>
+          <w:p>
+            <w:r>
+              <w:rPr>
+                <w:color w:val="2A3A50"/>
+                <w:sz w:val="19"/>
+              </w:rPr>
+              <w:t>issued</w:t>
+            </w:r>
+          </w:p>
+        </w:tc>
+        <w:tc>
+          <w:tcPr>
+            <w:tcW w:type="dxa" w:w="3120"/>
+            <w:shd w:val="clear" w:color="auto" w:fill="EBF2FA"/>
+            <w:tcBorders>
+              <w:top w:val="single" w:sz="4" w:color="B0C4DE"/>
+              <w:left w:val="single" w:sz="4" w:color="B0C4DE"/>
+              <w:bottom w:val="single" w:sz="4" w:color="B0C4DE"/>
+              <w:right w:val="single" w:sz="4" w:color="B0C4DE"/>
+            </w:tcBorders>
+            <w:vAlign w:val="center"/>
+          </w:tcPr>
+          <w:p>
+            <w:r>
+              <w:rPr>
+                <w:color w:val="2A3A50"/>
+                <w:sz w:val="19"/>
+              </w:rPr>
+              <w:t>Anyone</w:t>
+            </w:r>
+          </w:p>
+        </w:tc>
+        <w:tc>
+          <w:tcPr>
+            <w:tcW w:type="dxa" w:w="3120"/>
+            <w:shd w:val="clear" w:color="auto" w:fill="EBF2FA"/>
+            <w:tcBorders>
+              <w:top w:val="single" w:sz="4" w:color="B0C4DE"/>
+              <w:left w:val="single" w:sz="4" w:color="B0C4DE"/>
+              <w:bottom w:val="single" w:sz="4" w:color="B0C4DE"/>
+              <w:right w:val="single" w:sz="4" w:color="B0C4DE"/>
+            </w:tcBorders>
+            <w:vAlign w:val="center"/>
+          </w:tcPr>
+          <w:p>
+            <w:r>
+              <w:rPr>
+                <w:color w:val="2A3A50"/>
+                <w:sz w:val="19"/>
+              </w:rPr>
+              <w:t>Read-only issued report</w:t>
+            </w:r>
+          </w:p>
+        </w:tc>
+      </w:tr>
+    </w:tbl>
+    <w:p>
+      <w:r>
+        <w:br w:type="page"/>
+      </w:r>
+    </w:p>
+    <w:p>
+      <w:r>
+        <w:rPr>
+          <w:b/>
+          <w:color w:val="1A3A5C"/>
+          <w:sz w:val="26"/>
+        </w:rPr>
+        <w:t>SECTION 4 — Roles and Permissions</w:t>
+      </w:r>
+    </w:p>
+    <w:tbl>
+      <w:tblPr>
+        <w:tblStyle w:val="TableGrid"/>
+        <w:tblW w:type="auto" w:w="0"/>
+        <w:tblLook w:firstColumn="1" w:firstRow="1" w:lastColumn="0" w:lastRow="0" w:noHBand="0" w:noVBand="1" w:val="04A0"/>
+      </w:tblPr>
+      <w:tblGrid>
+        <w:gridCol w:w="2160"/>
+        <w:gridCol w:w="3168"/>
+        <w:gridCol w:w="3168"/>
+        <w:gridCol w:w="1584"/>
+      </w:tblGrid>
+      <w:tr>
+        <w:tc>
+          <w:tcPr>
+            <w:tcW w:type="dxa" w:w="2340"/>
+            <w:shd w:val="clear" w:color="auto" w:fill="1A3A5C"/>
             <w:tcBorders>
               <w:top w:val="single" w:sz="4" w:color="B0C4DE"/>
               <w:left w:val="single" w:sz="4" w:color="B0C4DE"/>
@@ -1374,21 +1992,22 @@
           </w:tcPr>
           <w:p>
             <w:pPr>
-              <w:jc w:val="left"/>
+              <w:jc w:val="center"/>
             </w:pPr>
             <w:r>
               <w:rPr>
-                <w:color w:val="2A3A50"/>
-                <w:sz w:val="19"/>
+                <w:b/>
+                <w:color w:val="FFFFFF"/>
+                <w:sz w:val="20"/>
               </w:rPr>
-              <w:t>Sensitivity Selection</w:t>
+              <w:t>Role</w:t>
             </w:r>
           </w:p>
         </w:tc>
         <w:tc>
           <w:tcPr>
-            <w:tcW w:type="dxa" w:w="3120"/>
-            <w:shd w:val="clear" w:color="auto" w:fill="E8F8F0"/>
+            <w:tcW w:type="dxa" w:w="2340"/>
+            <w:shd w:val="clear" w:color="auto" w:fill="1A3A5C"/>
             <w:tcBorders>
               <w:top w:val="single" w:sz="4" w:color="B0C4DE"/>
               <w:left w:val="single" w:sz="4" w:color="B0C4DE"/>
@@ -1399,23 +2018,22 @@
           </w:tcPr>
           <w:p>
             <w:pPr>
-              <w:jc w:val="left"/>
+              <w:jc w:val="center"/>
             </w:pPr>
             <w:r>
               <w:rPr>
-                <w:color w:val="2A3A50"/>
-                <w:sz w:val="19"/>
+                <w:b/>
+                <w:color w:val="FFFFFF"/>
+                <w:sz w:val="20"/>
               </w:rPr>
-              <w:t>Sensitivity combo box</w:t>
-              <w:br/>
-              <w:t>(top-right of each observation)</w:t>
+              <w:t>Can Do</w:t>
             </w:r>
           </w:p>
         </w:tc>
         <w:tc>
           <w:tcPr>
-            <w:tcW w:type="dxa" w:w="3120"/>
-            <w:shd w:val="clear" w:color="auto" w:fill="E8F8F0"/>
+            <w:tcW w:type="dxa" w:w="2340"/>
+            <w:shd w:val="clear" w:color="auto" w:fill="1A3A5C"/>
             <w:tcBorders>
               <w:top w:val="single" w:sz="4" w:color="B0C4DE"/>
               <w:left w:val="single" w:sz="4" w:color="B0C4DE"/>
@@ -1426,14 +2044,401 @@
           </w:tcPr>
           <w:p>
             <w:pPr>
-              <w:jc w:val="left"/>
+              <w:jc w:val="center"/>
             </w:pPr>
+            <w:r>
+              <w:rPr>
+                <w:b/>
+                <w:color w:val="FFFFFF"/>
+                <w:sz w:val="20"/>
+              </w:rPr>
+              <w:t>Cannot Do</w:t>
+            </w:r>
+          </w:p>
+        </w:tc>
+        <w:tc>
+          <w:tcPr>
+            <w:tcW w:type="dxa" w:w="2340"/>
+            <w:shd w:val="clear" w:color="auto" w:fill="1A3A5C"/>
+            <w:tcBorders>
+              <w:top w:val="single" w:sz="4" w:color="B0C4DE"/>
+              <w:left w:val="single" w:sz="4" w:color="B0C4DE"/>
+              <w:bottom w:val="single" w:sz="4" w:color="B0C4DE"/>
+              <w:right w:val="single" w:sz="4" w:color="B0C4DE"/>
+            </w:tcBorders>
+            <w:vAlign w:val="center"/>
+          </w:tcPr>
+          <w:p>
+            <w:pPr>
+              <w:jc w:val="center"/>
+            </w:pPr>
+            <w:r>
+              <w:rPr>
+                <w:b/>
+                <w:color w:val="FFFFFF"/>
+                <w:sz w:val="20"/>
+              </w:rPr>
+              <w:t>Tool</w:t>
+            </w:r>
+          </w:p>
+        </w:tc>
+      </w:tr>
+      <w:tr>
+        <w:tc>
+          <w:tcPr>
+            <w:tcW w:type="dxa" w:w="2340"/>
+            <w:shd w:val="clear" w:color="auto" w:fill="F5F8FC"/>
+            <w:tcBorders>
+              <w:top w:val="single" w:sz="4" w:color="B0C4DE"/>
+              <w:left w:val="single" w:sz="4" w:color="B0C4DE"/>
+              <w:bottom w:val="single" w:sz="4" w:color="B0C4DE"/>
+              <w:right w:val="single" w:sz="4" w:color="B0C4DE"/>
+            </w:tcBorders>
+            <w:vAlign w:val="center"/>
+          </w:tcPr>
+          <w:p>
             <w:r>
               <w:rPr>
                 <w:color w:val="2A3A50"/>
                 <w:sz w:val="19"/>
               </w:rPr>
-              <w:t>Auditor's own assessment — one input only. Overrides system recommendation if changed. Auditor must explicitly confirm selection (confirmation prompt prevents accidental clicks).</w:t>
+              <w:t>Auditor</w:t>
+            </w:r>
+          </w:p>
+        </w:tc>
+        <w:tc>
+          <w:tcPr>
+            <w:tcW w:type="dxa" w:w="2340"/>
+            <w:shd w:val="clear" w:color="auto" w:fill="F5F8FC"/>
+            <w:tcBorders>
+              <w:top w:val="single" w:sz="4" w:color="B0C4DE"/>
+              <w:left w:val="single" w:sz="4" w:color="B0C4DE"/>
+              <w:bottom w:val="single" w:sz="4" w:color="B0C4DE"/>
+              <w:right w:val="single" w:sz="4" w:color="B0C4DE"/>
+            </w:tcBorders>
+            <w:vAlign w:val="center"/>
+          </w:tcPr>
+          <w:p>
+            <w:r>
+              <w:rPr>
+                <w:color w:val="2A3A50"/>
+                <w:sz w:val="19"/>
+              </w:rPr>
+              <w:t>Create/edit observations, set sensitivity, fill RO/HO response fields, load branch response, send to Auditee, forward to RO</w:t>
+            </w:r>
+          </w:p>
+        </w:tc>
+        <w:tc>
+          <w:tcPr>
+            <w:tcW w:type="dxa" w:w="2340"/>
+            <w:shd w:val="clear" w:color="auto" w:fill="F5F8FC"/>
+            <w:tcBorders>
+              <w:top w:val="single" w:sz="4" w:color="B0C4DE"/>
+              <w:left w:val="single" w:sz="4" w:color="B0C4DE"/>
+              <w:bottom w:val="single" w:sz="4" w:color="B0C4DE"/>
+              <w:right w:val="single" w:sz="4" w:color="B0C4DE"/>
+            </w:tcBorders>
+            <w:vAlign w:val="center"/>
+          </w:tcPr>
+          <w:p>
+            <w:r>
+              <w:rPr>
+                <w:color w:val="2A3A50"/>
+                <w:sz w:val="19"/>
+              </w:rPr>
+              <w:t>Change branch response after loading, issue report, amend at RO/HO level</w:t>
+            </w:r>
+          </w:p>
+        </w:tc>
+        <w:tc>
+          <w:tcPr>
+            <w:tcW w:type="dxa" w:w="2340"/>
+            <w:shd w:val="clear" w:color="auto" w:fill="F5F8FC"/>
+            <w:tcBorders>
+              <w:top w:val="single" w:sz="4" w:color="B0C4DE"/>
+              <w:left w:val="single" w:sz="4" w:color="B0C4DE"/>
+              <w:bottom w:val="single" w:sz="4" w:color="B0C4DE"/>
+              <w:right w:val="single" w:sz="4" w:color="B0C4DE"/>
+            </w:tcBorders>
+            <w:vAlign w:val="center"/>
+          </w:tcPr>
+          <w:p>
+            <w:r>
+              <w:rPr>
+                <w:color w:val="2A3A50"/>
+                <w:sz w:val="19"/>
+              </w:rPr>
+              <w:t>index.html</w:t>
+            </w:r>
+          </w:p>
+        </w:tc>
+      </w:tr>
+      <w:tr>
+        <w:tc>
+          <w:tcPr>
+            <w:tcW w:type="dxa" w:w="2340"/>
+            <w:shd w:val="clear" w:color="auto" w:fill="EBF2FA"/>
+            <w:tcBorders>
+              <w:top w:val="single" w:sz="4" w:color="B0C4DE"/>
+              <w:left w:val="single" w:sz="4" w:color="B0C4DE"/>
+              <w:bottom w:val="single" w:sz="4" w:color="B0C4DE"/>
+              <w:right w:val="single" w:sz="4" w:color="B0C4DE"/>
+            </w:tcBorders>
+            <w:vAlign w:val="center"/>
+          </w:tcPr>
+          <w:p>
+            <w:r>
+              <w:rPr>
+                <w:color w:val="2A3A50"/>
+                <w:sz w:val="19"/>
+              </w:rPr>
+              <w:t>Auditee (Branch)</w:t>
+            </w:r>
+          </w:p>
+        </w:tc>
+        <w:tc>
+          <w:tcPr>
+            <w:tcW w:type="dxa" w:w="2340"/>
+            <w:shd w:val="clear" w:color="auto" w:fill="EBF2FA"/>
+            <w:tcBorders>
+              <w:top w:val="single" w:sz="4" w:color="B0C4DE"/>
+              <w:left w:val="single" w:sz="4" w:color="B0C4DE"/>
+              <w:bottom w:val="single" w:sz="4" w:color="B0C4DE"/>
+              <w:right w:val="single" w:sz="4" w:color="B0C4DE"/>
+            </w:tcBorders>
+            <w:vAlign w:val="center"/>
+          </w:tcPr>
+          <w:p>
+            <w:r>
+              <w:rPr>
+                <w:color w:val="2A3A50"/>
+                <w:sz w:val="19"/>
+              </w:rPr>
+              <w:t>Fill branch response fields only</w:t>
+            </w:r>
+          </w:p>
+        </w:tc>
+        <w:tc>
+          <w:tcPr>
+            <w:tcW w:type="dxa" w:w="2340"/>
+            <w:shd w:val="clear" w:color="auto" w:fill="EBF2FA"/>
+            <w:tcBorders>
+              <w:top w:val="single" w:sz="4" w:color="B0C4DE"/>
+              <w:left w:val="single" w:sz="4" w:color="B0C4DE"/>
+              <w:bottom w:val="single" w:sz="4" w:color="B0C4DE"/>
+              <w:right w:val="single" w:sz="4" w:color="B0C4DE"/>
+            </w:tcBorders>
+            <w:vAlign w:val="center"/>
+          </w:tcPr>
+          <w:p>
+            <w:r>
+              <w:rPr>
+                <w:color w:val="2A3A50"/>
+                <w:sz w:val="19"/>
+              </w:rPr>
+              <w:t>Change observation text, sensitivity, or any other field</w:t>
+            </w:r>
+          </w:p>
+        </w:tc>
+        <w:tc>
+          <w:tcPr>
+            <w:tcW w:type="dxa" w:w="2340"/>
+            <w:shd w:val="clear" w:color="auto" w:fill="EBF2FA"/>
+            <w:tcBorders>
+              <w:top w:val="single" w:sz="4" w:color="B0C4DE"/>
+              <w:left w:val="single" w:sz="4" w:color="B0C4DE"/>
+              <w:bottom w:val="single" w:sz="4" w:color="B0C4DE"/>
+              <w:right w:val="single" w:sz="4" w:color="B0C4DE"/>
+            </w:tcBorders>
+            <w:vAlign w:val="center"/>
+          </w:tcPr>
+          <w:p>
+            <w:r>
+              <w:rPr>
+                <w:color w:val="2A3A50"/>
+                <w:sz w:val="19"/>
+              </w:rPr>
+              <w:t>Soft Copy HTML</w:t>
+            </w:r>
+          </w:p>
+        </w:tc>
+      </w:tr>
+      <w:tr>
+        <w:tc>
+          <w:tcPr>
+            <w:tcW w:type="dxa" w:w="2340"/>
+            <w:shd w:val="clear" w:color="auto" w:fill="F5F8FC"/>
+            <w:tcBorders>
+              <w:top w:val="single" w:sz="4" w:color="B0C4DE"/>
+              <w:left w:val="single" w:sz="4" w:color="B0C4DE"/>
+              <w:bottom w:val="single" w:sz="4" w:color="B0C4DE"/>
+              <w:right w:val="single" w:sz="4" w:color="B0C4DE"/>
+            </w:tcBorders>
+            <w:vAlign w:val="center"/>
+          </w:tcPr>
+          <w:p>
+            <w:r>
+              <w:rPr>
+                <w:color w:val="2A3A50"/>
+                <w:sz w:val="19"/>
+              </w:rPr>
+              <w:t>RO Manager</w:t>
+            </w:r>
+          </w:p>
+        </w:tc>
+        <w:tc>
+          <w:tcPr>
+            <w:tcW w:type="dxa" w:w="2340"/>
+            <w:shd w:val="clear" w:color="auto" w:fill="F5F8FC"/>
+            <w:tcBorders>
+              <w:top w:val="single" w:sz="4" w:color="B0C4DE"/>
+              <w:left w:val="single" w:sz="4" w:color="B0C4DE"/>
+              <w:bottom w:val="single" w:sz="4" w:color="B0C4DE"/>
+              <w:right w:val="single" w:sz="4" w:color="B0C4DE"/>
+            </w:tcBorders>
+            <w:vAlign w:val="center"/>
+          </w:tcPr>
+          <w:p>
+            <w:r>
+              <w:rPr>
+                <w:color w:val="2A3A50"/>
+                <w:sz w:val="19"/>
+              </w:rPr>
+              <w:t>Review all observations, accept/decline wording changes, flag + comment per obs, amend auditee response (with evidence), send back to Auditor or forward to HO</w:t>
+            </w:r>
+          </w:p>
+        </w:tc>
+        <w:tc>
+          <w:tcPr>
+            <w:tcW w:type="dxa" w:w="2340"/>
+            <w:shd w:val="clear" w:color="auto" w:fill="F5F8FC"/>
+            <w:tcBorders>
+              <w:top w:val="single" w:sz="4" w:color="B0C4DE"/>
+              <w:left w:val="single" w:sz="4" w:color="B0C4DE"/>
+              <w:bottom w:val="single" w:sz="4" w:color="B0C4DE"/>
+              <w:right w:val="single" w:sz="4" w:color="B0C4DE"/>
+            </w:tcBorders>
+            <w:vAlign w:val="center"/>
+          </w:tcPr>
+          <w:p>
+            <w:r>
+              <w:rPr>
+                <w:color w:val="2A3A50"/>
+                <w:sz w:val="19"/>
+              </w:rPr>
+              <w:t>Edit observation text directly, change sensitivity, issue report</w:t>
+            </w:r>
+          </w:p>
+        </w:tc>
+        <w:tc>
+          <w:tcPr>
+            <w:tcW w:type="dxa" w:w="2340"/>
+            <w:shd w:val="clear" w:color="auto" w:fill="F5F8FC"/>
+            <w:tcBorders>
+              <w:top w:val="single" w:sz="4" w:color="B0C4DE"/>
+              <w:left w:val="single" w:sz="4" w:color="B0C4DE"/>
+              <w:bottom w:val="single" w:sz="4" w:color="B0C4DE"/>
+              <w:right w:val="single" w:sz="4" w:color="B0C4DE"/>
+            </w:tcBorders>
+            <w:vAlign w:val="center"/>
+          </w:tcPr>
+          <w:p>
+            <w:r>
+              <w:rPr>
+                <w:color w:val="2A3A50"/>
+                <w:sz w:val="19"/>
+              </w:rPr>
+              <w:t>bss_reviewer.html</w:t>
+            </w:r>
+          </w:p>
+        </w:tc>
+      </w:tr>
+      <w:tr>
+        <w:tc>
+          <w:tcPr>
+            <w:tcW w:type="dxa" w:w="2340"/>
+            <w:shd w:val="clear" w:color="auto" w:fill="EBF2FA"/>
+            <w:tcBorders>
+              <w:top w:val="single" w:sz="4" w:color="B0C4DE"/>
+              <w:left w:val="single" w:sz="4" w:color="B0C4DE"/>
+              <w:bottom w:val="single" w:sz="4" w:color="B0C4DE"/>
+              <w:right w:val="single" w:sz="4" w:color="B0C4DE"/>
+            </w:tcBorders>
+            <w:vAlign w:val="center"/>
+          </w:tcPr>
+          <w:p>
+            <w:r>
+              <w:rPr>
+                <w:color w:val="2A3A50"/>
+                <w:sz w:val="19"/>
+              </w:rPr>
+              <w:t>HO</w:t>
+            </w:r>
+          </w:p>
+        </w:tc>
+        <w:tc>
+          <w:tcPr>
+            <w:tcW w:type="dxa" w:w="2340"/>
+            <w:shd w:val="clear" w:color="auto" w:fill="EBF2FA"/>
+            <w:tcBorders>
+              <w:top w:val="single" w:sz="4" w:color="B0C4DE"/>
+              <w:left w:val="single" w:sz="4" w:color="B0C4DE"/>
+              <w:bottom w:val="single" w:sz="4" w:color="B0C4DE"/>
+              <w:right w:val="single" w:sz="4" w:color="B0C4DE"/>
+            </w:tcBorders>
+            <w:vAlign w:val="center"/>
+          </w:tcPr>
+          <w:p>
+            <w:r>
+              <w:rPr>
+                <w:color w:val="2A3A50"/>
+                <w:sz w:val="19"/>
+              </w:rPr>
+              <w:t>All RO permissions + final issuance authority, send back to RO</w:t>
+            </w:r>
+          </w:p>
+        </w:tc>
+        <w:tc>
+          <w:tcPr>
+            <w:tcW w:type="dxa" w:w="2340"/>
+            <w:shd w:val="clear" w:color="auto" w:fill="EBF2FA"/>
+            <w:tcBorders>
+              <w:top w:val="single" w:sz="4" w:color="B0C4DE"/>
+              <w:left w:val="single" w:sz="4" w:color="B0C4DE"/>
+              <w:bottom w:val="single" w:sz="4" w:color="B0C4DE"/>
+              <w:right w:val="single" w:sz="4" w:color="B0C4DE"/>
+            </w:tcBorders>
+            <w:vAlign w:val="center"/>
+          </w:tcPr>
+          <w:p>
+            <w:r>
+              <w:rPr>
+                <w:color w:val="2A3A50"/>
+                <w:sz w:val="19"/>
+              </w:rPr>
+              <w:t>—</w:t>
+            </w:r>
+          </w:p>
+        </w:tc>
+        <w:tc>
+          <w:tcPr>
+            <w:tcW w:type="dxa" w:w="2340"/>
+            <w:shd w:val="clear" w:color="auto" w:fill="EBF2FA"/>
+            <w:tcBorders>
+              <w:top w:val="single" w:sz="4" w:color="B0C4DE"/>
+              <w:left w:val="single" w:sz="4" w:color="B0C4DE"/>
+              <w:bottom w:val="single" w:sz="4" w:color="B0C4DE"/>
+              <w:right w:val="single" w:sz="4" w:color="B0C4DE"/>
+            </w:tcBorders>
+            <w:vAlign w:val="center"/>
+          </w:tcPr>
+          <w:p>
+            <w:r>
+              <w:rPr>
+                <w:color w:val="2A3A50"/>
+                <w:sz w:val="19"/>
+              </w:rPr>
+              <w:t>bss_reviewer.html</w:t>
             </w:r>
           </w:p>
         </w:tc>
@@ -1445,9 +2450,884 @@
         <w:rPr>
           <w:b/>
           <w:color w:val="1A3A5C"/>
-          <w:sz w:val="20"/>
+          <w:sz w:val="26"/>
         </w:rPr>
-        <w:t>Sensitivity Combo Box States:</w:t>
+        <w:t>SECTION 5 — Data Fields per Observation (Extended)</w:t>
+      </w:r>
+    </w:p>
+    <w:p>
+      <w:r>
+        <w:rPr>
+          <w:i/>
+          <w:color w:val="555555"/>
+          <w:sz w:val="19"/>
+        </w:rPr>
+        <w:t>All fields travel with the session file through every stage. Branch response is locked after loading.</w:t>
+      </w:r>
+    </w:p>
+    <w:tbl>
+      <w:tblPr>
+        <w:tblStyle w:val="TableGrid"/>
+        <w:tblW w:type="auto" w:w="0"/>
+        <w:tblLook w:firstColumn="1" w:firstRow="1" w:lastColumn="0" w:lastRow="0" w:noHBand="0" w:noVBand="1" w:val="04A0"/>
+      </w:tblPr>
+      <w:tblGrid>
+        <w:gridCol w:w="2592"/>
+        <w:gridCol w:w="2160"/>
+        <w:gridCol w:w="5328"/>
+      </w:tblGrid>
+      <w:tr>
+        <w:tc>
+          <w:tcPr>
+            <w:tcW w:type="dxa" w:w="3120"/>
+            <w:shd w:val="clear" w:color="auto" w:fill="1A3A5C"/>
+            <w:tcBorders>
+              <w:top w:val="single" w:sz="4" w:color="B0C4DE"/>
+              <w:left w:val="single" w:sz="4" w:color="B0C4DE"/>
+              <w:bottom w:val="single" w:sz="4" w:color="B0C4DE"/>
+              <w:right w:val="single" w:sz="4" w:color="B0C4DE"/>
+            </w:tcBorders>
+            <w:vAlign w:val="center"/>
+          </w:tcPr>
+          <w:p>
+            <w:pPr>
+              <w:jc w:val="center"/>
+            </w:pPr>
+            <w:r>
+              <w:rPr>
+                <w:b/>
+                <w:color w:val="FFFFFF"/>
+                <w:sz w:val="20"/>
+              </w:rPr>
+              <w:t>Field</w:t>
+            </w:r>
+          </w:p>
+        </w:tc>
+        <w:tc>
+          <w:tcPr>
+            <w:tcW w:type="dxa" w:w="3120"/>
+            <w:shd w:val="clear" w:color="auto" w:fill="1A3A5C"/>
+            <w:tcBorders>
+              <w:top w:val="single" w:sz="4" w:color="B0C4DE"/>
+              <w:left w:val="single" w:sz="4" w:color="B0C4DE"/>
+              <w:bottom w:val="single" w:sz="4" w:color="B0C4DE"/>
+              <w:right w:val="single" w:sz="4" w:color="B0C4DE"/>
+            </w:tcBorders>
+            <w:vAlign w:val="center"/>
+          </w:tcPr>
+          <w:p>
+            <w:pPr>
+              <w:jc w:val="center"/>
+            </w:pPr>
+            <w:r>
+              <w:rPr>
+                <w:b/>
+                <w:color w:val="FFFFFF"/>
+                <w:sz w:val="20"/>
+              </w:rPr>
+              <w:t>Set By</w:t>
+            </w:r>
+          </w:p>
+        </w:tc>
+        <w:tc>
+          <w:tcPr>
+            <w:tcW w:type="dxa" w:w="3120"/>
+            <w:shd w:val="clear" w:color="auto" w:fill="1A3A5C"/>
+            <w:tcBorders>
+              <w:top w:val="single" w:sz="4" w:color="B0C4DE"/>
+              <w:left w:val="single" w:sz="4" w:color="B0C4DE"/>
+              <w:bottom w:val="single" w:sz="4" w:color="B0C4DE"/>
+              <w:right w:val="single" w:sz="4" w:color="B0C4DE"/>
+            </w:tcBorders>
+            <w:vAlign w:val="center"/>
+          </w:tcPr>
+          <w:p>
+            <w:pPr>
+              <w:jc w:val="center"/>
+            </w:pPr>
+            <w:r>
+              <w:rPr>
+                <w:b/>
+                <w:color w:val="FFFFFF"/>
+                <w:sz w:val="20"/>
+              </w:rPr>
+              <w:t>Purpose</w:t>
+            </w:r>
+          </w:p>
+        </w:tc>
+      </w:tr>
+      <w:tr>
+        <w:tc>
+          <w:tcPr>
+            <w:tcW w:type="dxa" w:w="3120"/>
+            <w:shd w:val="clear" w:color="auto" w:fill="F5F8FC"/>
+            <w:tcBorders>
+              <w:top w:val="single" w:sz="4" w:color="B0C4DE"/>
+              <w:left w:val="single" w:sz="4" w:color="B0C4DE"/>
+              <w:bottom w:val="single" w:sz="4" w:color="B0C4DE"/>
+              <w:right w:val="single" w:sz="4" w:color="B0C4DE"/>
+            </w:tcBorders>
+            <w:vAlign w:val="center"/>
+          </w:tcPr>
+          <w:p>
+            <w:r>
+              <w:rPr>
+                <w:color w:val="2A3A50"/>
+                <w:sz w:val="19"/>
+              </w:rPr>
+              <w:t>respMap[id]</w:t>
+            </w:r>
+          </w:p>
+        </w:tc>
+        <w:tc>
+          <w:tcPr>
+            <w:tcW w:type="dxa" w:w="3120"/>
+            <w:shd w:val="clear" w:color="auto" w:fill="F5F8FC"/>
+            <w:tcBorders>
+              <w:top w:val="single" w:sz="4" w:color="B0C4DE"/>
+              <w:left w:val="single" w:sz="4" w:color="B0C4DE"/>
+              <w:bottom w:val="single" w:sz="4" w:color="B0C4DE"/>
+              <w:right w:val="single" w:sz="4" w:color="B0C4DE"/>
+            </w:tcBorders>
+            <w:vAlign w:val="center"/>
+          </w:tcPr>
+          <w:p>
+            <w:r>
+              <w:rPr>
+                <w:color w:val="2A3A50"/>
+                <w:sz w:val="19"/>
+              </w:rPr>
+              <w:t>Auditee (Branch)</w:t>
+            </w:r>
+          </w:p>
+        </w:tc>
+        <w:tc>
+          <w:tcPr>
+            <w:tcW w:type="dxa" w:w="3120"/>
+            <w:shd w:val="clear" w:color="auto" w:fill="F5F8FC"/>
+            <w:tcBorders>
+              <w:top w:val="single" w:sz="4" w:color="B0C4DE"/>
+              <w:left w:val="single" w:sz="4" w:color="B0C4DE"/>
+              <w:bottom w:val="single" w:sz="4" w:color="B0C4DE"/>
+              <w:right w:val="single" w:sz="4" w:color="B0C4DE"/>
+            </w:tcBorders>
+            <w:vAlign w:val="center"/>
+          </w:tcPr>
+          <w:p>
+            <w:r>
+              <w:rPr>
+                <w:color w:val="2A3A50"/>
+                <w:sz w:val="19"/>
+              </w:rPr>
+              <w:t>Branch response — locked after auditor loads the returned soft copy. Never overwritten.</w:t>
+            </w:r>
+          </w:p>
+        </w:tc>
+      </w:tr>
+      <w:tr>
+        <w:tc>
+          <w:tcPr>
+            <w:tcW w:type="dxa" w:w="3120"/>
+            <w:shd w:val="clear" w:color="auto" w:fill="EBF2FA"/>
+            <w:tcBorders>
+              <w:top w:val="single" w:sz="4" w:color="B0C4DE"/>
+              <w:left w:val="single" w:sz="4" w:color="B0C4DE"/>
+              <w:bottom w:val="single" w:sz="4" w:color="B0C4DE"/>
+              <w:right w:val="single" w:sz="4" w:color="B0C4DE"/>
+            </w:tcBorders>
+            <w:vAlign w:val="center"/>
+          </w:tcPr>
+          <w:p>
+            <w:r>
+              <w:rPr>
+                <w:color w:val="2A3A50"/>
+                <w:sz w:val="19"/>
+              </w:rPr>
+              <w:t>respROMap[id]</w:t>
+            </w:r>
+          </w:p>
+        </w:tc>
+        <w:tc>
+          <w:tcPr>
+            <w:tcW w:type="dxa" w:w="3120"/>
+            <w:shd w:val="clear" w:color="auto" w:fill="EBF2FA"/>
+            <w:tcBorders>
+              <w:top w:val="single" w:sz="4" w:color="B0C4DE"/>
+              <w:left w:val="single" w:sz="4" w:color="B0C4DE"/>
+              <w:bottom w:val="single" w:sz="4" w:color="B0C4DE"/>
+              <w:right w:val="single" w:sz="4" w:color="B0C4DE"/>
+            </w:tcBorders>
+            <w:vAlign w:val="center"/>
+          </w:tcPr>
+          <w:p>
+            <w:r>
+              <w:rPr>
+                <w:color w:val="2A3A50"/>
+                <w:sz w:val="19"/>
+              </w:rPr>
+              <w:t>Auditor</w:t>
+            </w:r>
+          </w:p>
+        </w:tc>
+        <w:tc>
+          <w:tcPr>
+            <w:tcW w:type="dxa" w:w="3120"/>
+            <w:shd w:val="clear" w:color="auto" w:fill="EBF2FA"/>
+            <w:tcBorders>
+              <w:top w:val="single" w:sz="4" w:color="B0C4DE"/>
+              <w:left w:val="single" w:sz="4" w:color="B0C4DE"/>
+              <w:bottom w:val="single" w:sz="4" w:color="B0C4DE"/>
+              <w:right w:val="single" w:sz="4" w:color="B0C4DE"/>
+            </w:tcBorders>
+            <w:vAlign w:val="center"/>
+          </w:tcPr>
+          <w:p>
+            <w:r>
+              <w:rPr>
+                <w:color w:val="2A3A50"/>
+                <w:sz w:val="19"/>
+              </w:rPr>
+              <w:t>RO/HO level formal management response — filled by auditor during draft stage.</w:t>
+            </w:r>
+          </w:p>
+        </w:tc>
+      </w:tr>
+      <w:tr>
+        <w:tc>
+          <w:tcPr>
+            <w:tcW w:type="dxa" w:w="3120"/>
+            <w:shd w:val="clear" w:color="auto" w:fill="F5F8FC"/>
+            <w:tcBorders>
+              <w:top w:val="single" w:sz="4" w:color="B0C4DE"/>
+              <w:left w:val="single" w:sz="4" w:color="B0C4DE"/>
+              <w:bottom w:val="single" w:sz="4" w:color="B0C4DE"/>
+              <w:right w:val="single" w:sz="4" w:color="B0C4DE"/>
+            </w:tcBorders>
+            <w:vAlign w:val="center"/>
+          </w:tcPr>
+          <w:p>
+            <w:r>
+              <w:rPr>
+                <w:color w:val="2A3A50"/>
+                <w:sz w:val="19"/>
+              </w:rPr>
+              <w:t>roFlag[id]</w:t>
+            </w:r>
+          </w:p>
+        </w:tc>
+        <w:tc>
+          <w:tcPr>
+            <w:tcW w:type="dxa" w:w="3120"/>
+            <w:shd w:val="clear" w:color="auto" w:fill="F5F8FC"/>
+            <w:tcBorders>
+              <w:top w:val="single" w:sz="4" w:color="B0C4DE"/>
+              <w:left w:val="single" w:sz="4" w:color="B0C4DE"/>
+              <w:bottom w:val="single" w:sz="4" w:color="B0C4DE"/>
+              <w:right w:val="single" w:sz="4" w:color="B0C4DE"/>
+            </w:tcBorders>
+            <w:vAlign w:val="center"/>
+          </w:tcPr>
+          <w:p>
+            <w:r>
+              <w:rPr>
+                <w:color w:val="2A3A50"/>
+                <w:sz w:val="19"/>
+              </w:rPr>
+              <w:t>RO Manager</w:t>
+            </w:r>
+          </w:p>
+        </w:tc>
+        <w:tc>
+          <w:tcPr>
+            <w:tcW w:type="dxa" w:w="3120"/>
+            <w:shd w:val="clear" w:color="auto" w:fill="F5F8FC"/>
+            <w:tcBorders>
+              <w:top w:val="single" w:sz="4" w:color="B0C4DE"/>
+              <w:left w:val="single" w:sz="4" w:color="B0C4DE"/>
+              <w:bottom w:val="single" w:sz="4" w:color="B0C4DE"/>
+              <w:right w:val="single" w:sz="4" w:color="B0C4DE"/>
+            </w:tcBorders>
+            <w:vAlign w:val="center"/>
+          </w:tcPr>
+          <w:p>
+            <w:r>
+              <w:rPr>
+                <w:color w:val="2A3A50"/>
+                <w:sz w:val="19"/>
+              </w:rPr>
+              <w:t>Marks this observation for correction. Triggers send-back to Auditor.</w:t>
+            </w:r>
+          </w:p>
+        </w:tc>
+      </w:tr>
+      <w:tr>
+        <w:tc>
+          <w:tcPr>
+            <w:tcW w:type="dxa" w:w="3120"/>
+            <w:shd w:val="clear" w:color="auto" w:fill="EBF2FA"/>
+            <w:tcBorders>
+              <w:top w:val="single" w:sz="4" w:color="B0C4DE"/>
+              <w:left w:val="single" w:sz="4" w:color="B0C4DE"/>
+              <w:bottom w:val="single" w:sz="4" w:color="B0C4DE"/>
+              <w:right w:val="single" w:sz="4" w:color="B0C4DE"/>
+            </w:tcBorders>
+            <w:vAlign w:val="center"/>
+          </w:tcPr>
+          <w:p>
+            <w:r>
+              <w:rPr>
+                <w:color w:val="2A3A50"/>
+                <w:sz w:val="19"/>
+              </w:rPr>
+              <w:t>roComment[id]</w:t>
+            </w:r>
+          </w:p>
+        </w:tc>
+        <w:tc>
+          <w:tcPr>
+            <w:tcW w:type="dxa" w:w="3120"/>
+            <w:shd w:val="clear" w:color="auto" w:fill="EBF2FA"/>
+            <w:tcBorders>
+              <w:top w:val="single" w:sz="4" w:color="B0C4DE"/>
+              <w:left w:val="single" w:sz="4" w:color="B0C4DE"/>
+              <w:bottom w:val="single" w:sz="4" w:color="B0C4DE"/>
+              <w:right w:val="single" w:sz="4" w:color="B0C4DE"/>
+            </w:tcBorders>
+            <w:vAlign w:val="center"/>
+          </w:tcPr>
+          <w:p>
+            <w:r>
+              <w:rPr>
+                <w:color w:val="2A3A50"/>
+                <w:sz w:val="19"/>
+              </w:rPr>
+              <w:t>RO Manager</w:t>
+            </w:r>
+          </w:p>
+        </w:tc>
+        <w:tc>
+          <w:tcPr>
+            <w:tcW w:type="dxa" w:w="3120"/>
+            <w:shd w:val="clear" w:color="auto" w:fill="EBF2FA"/>
+            <w:tcBorders>
+              <w:top w:val="single" w:sz="4" w:color="B0C4DE"/>
+              <w:left w:val="single" w:sz="4" w:color="B0C4DE"/>
+              <w:bottom w:val="single" w:sz="4" w:color="B0C4DE"/>
+              <w:right w:val="single" w:sz="4" w:color="B0C4DE"/>
+            </w:tcBorders>
+            <w:vAlign w:val="center"/>
+          </w:tcPr>
+          <w:p>
+            <w:r>
+              <w:rPr>
+                <w:color w:val="2A3A50"/>
+                <w:sz w:val="19"/>
+              </w:rPr>
+              <w:t>RO's specific instruction to auditor for correction.</w:t>
+            </w:r>
+          </w:p>
+        </w:tc>
+      </w:tr>
+      <w:tr>
+        <w:tc>
+          <w:tcPr>
+            <w:tcW w:type="dxa" w:w="3120"/>
+            <w:shd w:val="clear" w:color="auto" w:fill="F5F8FC"/>
+            <w:tcBorders>
+              <w:top w:val="single" w:sz="4" w:color="B0C4DE"/>
+              <w:left w:val="single" w:sz="4" w:color="B0C4DE"/>
+              <w:bottom w:val="single" w:sz="4" w:color="B0C4DE"/>
+              <w:right w:val="single" w:sz="4" w:color="B0C4DE"/>
+            </w:tcBorders>
+            <w:vAlign w:val="center"/>
+          </w:tcPr>
+          <w:p>
+            <w:r>
+              <w:rPr>
+                <w:color w:val="2A3A50"/>
+                <w:sz w:val="19"/>
+              </w:rPr>
+              <w:t>roCorrection[id]</w:t>
+            </w:r>
+          </w:p>
+        </w:tc>
+        <w:tc>
+          <w:tcPr>
+            <w:tcW w:type="dxa" w:w="3120"/>
+            <w:shd w:val="clear" w:color="auto" w:fill="F5F8FC"/>
+            <w:tcBorders>
+              <w:top w:val="single" w:sz="4" w:color="B0C4DE"/>
+              <w:left w:val="single" w:sz="4" w:color="B0C4DE"/>
+              <w:bottom w:val="single" w:sz="4" w:color="B0C4DE"/>
+              <w:right w:val="single" w:sz="4" w:color="B0C4DE"/>
+            </w:tcBorders>
+            <w:vAlign w:val="center"/>
+          </w:tcPr>
+          <w:p>
+            <w:r>
+              <w:rPr>
+                <w:color w:val="2A3A50"/>
+                <w:sz w:val="19"/>
+              </w:rPr>
+              <w:t>Auditor</w:t>
+            </w:r>
+          </w:p>
+        </w:tc>
+        <w:tc>
+          <w:tcPr>
+            <w:tcW w:type="dxa" w:w="3120"/>
+            <w:shd w:val="clear" w:color="auto" w:fill="F5F8FC"/>
+            <w:tcBorders>
+              <w:top w:val="single" w:sz="4" w:color="B0C4DE"/>
+              <w:left w:val="single" w:sz="4" w:color="B0C4DE"/>
+              <w:bottom w:val="single" w:sz="4" w:color="B0C4DE"/>
+              <w:right w:val="single" w:sz="4" w:color="B0C4DE"/>
+            </w:tcBorders>
+            <w:vAlign w:val="center"/>
+          </w:tcPr>
+          <w:p>
+            <w:r>
+              <w:rPr>
+                <w:color w:val="2A3A50"/>
+                <w:sz w:val="19"/>
+              </w:rPr>
+              <w:t>Auditor's response/correction to RO comment.</w:t>
+            </w:r>
+          </w:p>
+        </w:tc>
+      </w:tr>
+      <w:tr>
+        <w:tc>
+          <w:tcPr>
+            <w:tcW w:type="dxa" w:w="3120"/>
+            <w:shd w:val="clear" w:color="auto" w:fill="EBF2FA"/>
+            <w:tcBorders>
+              <w:top w:val="single" w:sz="4" w:color="B0C4DE"/>
+              <w:left w:val="single" w:sz="4" w:color="B0C4DE"/>
+              <w:bottom w:val="single" w:sz="4" w:color="B0C4DE"/>
+              <w:right w:val="single" w:sz="4" w:color="B0C4DE"/>
+            </w:tcBorders>
+            <w:vAlign w:val="center"/>
+          </w:tcPr>
+          <w:p>
+            <w:r>
+              <w:rPr>
+                <w:color w:val="2A3A50"/>
+                <w:sz w:val="19"/>
+              </w:rPr>
+              <w:t>roAccepted[id]</w:t>
+            </w:r>
+          </w:p>
+        </w:tc>
+        <w:tc>
+          <w:tcPr>
+            <w:tcW w:type="dxa" w:w="3120"/>
+            <w:shd w:val="clear" w:color="auto" w:fill="EBF2FA"/>
+            <w:tcBorders>
+              <w:top w:val="single" w:sz="4" w:color="B0C4DE"/>
+              <w:left w:val="single" w:sz="4" w:color="B0C4DE"/>
+              <w:bottom w:val="single" w:sz="4" w:color="B0C4DE"/>
+              <w:right w:val="single" w:sz="4" w:color="B0C4DE"/>
+            </w:tcBorders>
+            <w:vAlign w:val="center"/>
+          </w:tcPr>
+          <w:p>
+            <w:r>
+              <w:rPr>
+                <w:color w:val="2A3A50"/>
+                <w:sz w:val="19"/>
+              </w:rPr>
+              <w:t>RO Manager</w:t>
+            </w:r>
+          </w:p>
+        </w:tc>
+        <w:tc>
+          <w:tcPr>
+            <w:tcW w:type="dxa" w:w="3120"/>
+            <w:shd w:val="clear" w:color="auto" w:fill="EBF2FA"/>
+            <w:tcBorders>
+              <w:top w:val="single" w:sz="4" w:color="B0C4DE"/>
+              <w:left w:val="single" w:sz="4" w:color="B0C4DE"/>
+              <w:bottom w:val="single" w:sz="4" w:color="B0C4DE"/>
+              <w:right w:val="single" w:sz="4" w:color="B0C4DE"/>
+            </w:tcBorders>
+            <w:vAlign w:val="center"/>
+          </w:tcPr>
+          <w:p>
+            <w:r>
+              <w:rPr>
+                <w:color w:val="2A3A50"/>
+                <w:sz w:val="19"/>
+              </w:rPr>
+              <w:t>True when RO confirms the auditor correction is satisfactory.</w:t>
+            </w:r>
+          </w:p>
+        </w:tc>
+      </w:tr>
+      <w:tr>
+        <w:tc>
+          <w:tcPr>
+            <w:tcW w:type="dxa" w:w="3120"/>
+            <w:shd w:val="clear" w:color="auto" w:fill="F5F8FC"/>
+            <w:tcBorders>
+              <w:top w:val="single" w:sz="4" w:color="B0C4DE"/>
+              <w:left w:val="single" w:sz="4" w:color="B0C4DE"/>
+              <w:bottom w:val="single" w:sz="4" w:color="B0C4DE"/>
+              <w:right w:val="single" w:sz="4" w:color="B0C4DE"/>
+            </w:tcBorders>
+            <w:vAlign w:val="center"/>
+          </w:tcPr>
+          <w:p>
+            <w:r>
+              <w:rPr>
+                <w:color w:val="2A3A50"/>
+                <w:sz w:val="19"/>
+              </w:rPr>
+              <w:t>hoFlag[id]</w:t>
+            </w:r>
+          </w:p>
+        </w:tc>
+        <w:tc>
+          <w:tcPr>
+            <w:tcW w:type="dxa" w:w="3120"/>
+            <w:shd w:val="clear" w:color="auto" w:fill="F5F8FC"/>
+            <w:tcBorders>
+              <w:top w:val="single" w:sz="4" w:color="B0C4DE"/>
+              <w:left w:val="single" w:sz="4" w:color="B0C4DE"/>
+              <w:bottom w:val="single" w:sz="4" w:color="B0C4DE"/>
+              <w:right w:val="single" w:sz="4" w:color="B0C4DE"/>
+            </w:tcBorders>
+            <w:vAlign w:val="center"/>
+          </w:tcPr>
+          <w:p>
+            <w:r>
+              <w:rPr>
+                <w:color w:val="2A3A50"/>
+                <w:sz w:val="19"/>
+              </w:rPr>
+              <w:t>HO</w:t>
+            </w:r>
+          </w:p>
+        </w:tc>
+        <w:tc>
+          <w:tcPr>
+            <w:tcW w:type="dxa" w:w="3120"/>
+            <w:shd w:val="clear" w:color="auto" w:fill="F5F8FC"/>
+            <w:tcBorders>
+              <w:top w:val="single" w:sz="4" w:color="B0C4DE"/>
+              <w:left w:val="single" w:sz="4" w:color="B0C4DE"/>
+              <w:bottom w:val="single" w:sz="4" w:color="B0C4DE"/>
+              <w:right w:val="single" w:sz="4" w:color="B0C4DE"/>
+            </w:tcBorders>
+            <w:vAlign w:val="center"/>
+          </w:tcPr>
+          <w:p>
+            <w:r>
+              <w:rPr>
+                <w:color w:val="2A3A50"/>
+                <w:sz w:val="19"/>
+              </w:rPr>
+              <w:t>Marks this observation for correction. Triggers send-back to RO.</w:t>
+            </w:r>
+          </w:p>
+        </w:tc>
+      </w:tr>
+      <w:tr>
+        <w:tc>
+          <w:tcPr>
+            <w:tcW w:type="dxa" w:w="3120"/>
+            <w:shd w:val="clear" w:color="auto" w:fill="EBF2FA"/>
+            <w:tcBorders>
+              <w:top w:val="single" w:sz="4" w:color="B0C4DE"/>
+              <w:left w:val="single" w:sz="4" w:color="B0C4DE"/>
+              <w:bottom w:val="single" w:sz="4" w:color="B0C4DE"/>
+              <w:right w:val="single" w:sz="4" w:color="B0C4DE"/>
+            </w:tcBorders>
+            <w:vAlign w:val="center"/>
+          </w:tcPr>
+          <w:p>
+            <w:r>
+              <w:rPr>
+                <w:color w:val="2A3A50"/>
+                <w:sz w:val="19"/>
+              </w:rPr>
+              <w:t>hoComment[id]</w:t>
+            </w:r>
+          </w:p>
+        </w:tc>
+        <w:tc>
+          <w:tcPr>
+            <w:tcW w:type="dxa" w:w="3120"/>
+            <w:shd w:val="clear" w:color="auto" w:fill="EBF2FA"/>
+            <w:tcBorders>
+              <w:top w:val="single" w:sz="4" w:color="B0C4DE"/>
+              <w:left w:val="single" w:sz="4" w:color="B0C4DE"/>
+              <w:bottom w:val="single" w:sz="4" w:color="B0C4DE"/>
+              <w:right w:val="single" w:sz="4" w:color="B0C4DE"/>
+            </w:tcBorders>
+            <w:vAlign w:val="center"/>
+          </w:tcPr>
+          <w:p>
+            <w:r>
+              <w:rPr>
+                <w:color w:val="2A3A50"/>
+                <w:sz w:val="19"/>
+              </w:rPr>
+              <w:t>HO</w:t>
+            </w:r>
+          </w:p>
+        </w:tc>
+        <w:tc>
+          <w:tcPr>
+            <w:tcW w:type="dxa" w:w="3120"/>
+            <w:shd w:val="clear" w:color="auto" w:fill="EBF2FA"/>
+            <w:tcBorders>
+              <w:top w:val="single" w:sz="4" w:color="B0C4DE"/>
+              <w:left w:val="single" w:sz="4" w:color="B0C4DE"/>
+              <w:bottom w:val="single" w:sz="4" w:color="B0C4DE"/>
+              <w:right w:val="single" w:sz="4" w:color="B0C4DE"/>
+            </w:tcBorders>
+            <w:vAlign w:val="center"/>
+          </w:tcPr>
+          <w:p>
+            <w:r>
+              <w:rPr>
+                <w:color w:val="2A3A50"/>
+                <w:sz w:val="19"/>
+              </w:rPr>
+              <w:t>HO's specific instruction to RO for correction.</w:t>
+            </w:r>
+          </w:p>
+        </w:tc>
+      </w:tr>
+      <w:tr>
+        <w:tc>
+          <w:tcPr>
+            <w:tcW w:type="dxa" w:w="3120"/>
+            <w:shd w:val="clear" w:color="auto" w:fill="F5F8FC"/>
+            <w:tcBorders>
+              <w:top w:val="single" w:sz="4" w:color="B0C4DE"/>
+              <w:left w:val="single" w:sz="4" w:color="B0C4DE"/>
+              <w:bottom w:val="single" w:sz="4" w:color="B0C4DE"/>
+              <w:right w:val="single" w:sz="4" w:color="B0C4DE"/>
+            </w:tcBorders>
+            <w:vAlign w:val="center"/>
+          </w:tcPr>
+          <w:p>
+            <w:r>
+              <w:rPr>
+                <w:color w:val="2A3A50"/>
+                <w:sz w:val="19"/>
+              </w:rPr>
+              <w:t>hoCorrection[id]</w:t>
+            </w:r>
+          </w:p>
+        </w:tc>
+        <w:tc>
+          <w:tcPr>
+            <w:tcW w:type="dxa" w:w="3120"/>
+            <w:shd w:val="clear" w:color="auto" w:fill="F5F8FC"/>
+            <w:tcBorders>
+              <w:top w:val="single" w:sz="4" w:color="B0C4DE"/>
+              <w:left w:val="single" w:sz="4" w:color="B0C4DE"/>
+              <w:bottom w:val="single" w:sz="4" w:color="B0C4DE"/>
+              <w:right w:val="single" w:sz="4" w:color="B0C4DE"/>
+            </w:tcBorders>
+            <w:vAlign w:val="center"/>
+          </w:tcPr>
+          <w:p>
+            <w:r>
+              <w:rPr>
+                <w:color w:val="2A3A50"/>
+                <w:sz w:val="19"/>
+              </w:rPr>
+              <w:t>RO</w:t>
+            </w:r>
+          </w:p>
+        </w:tc>
+        <w:tc>
+          <w:tcPr>
+            <w:tcW w:type="dxa" w:w="3120"/>
+            <w:shd w:val="clear" w:color="auto" w:fill="F5F8FC"/>
+            <w:tcBorders>
+              <w:top w:val="single" w:sz="4" w:color="B0C4DE"/>
+              <w:left w:val="single" w:sz="4" w:color="B0C4DE"/>
+              <w:bottom w:val="single" w:sz="4" w:color="B0C4DE"/>
+              <w:right w:val="single" w:sz="4" w:color="B0C4DE"/>
+            </w:tcBorders>
+            <w:vAlign w:val="center"/>
+          </w:tcPr>
+          <w:p>
+            <w:r>
+              <w:rPr>
+                <w:color w:val="2A3A50"/>
+                <w:sz w:val="19"/>
+              </w:rPr>
+              <w:t>RO's response/correction to HO comment.</w:t>
+            </w:r>
+          </w:p>
+        </w:tc>
+      </w:tr>
+      <w:tr>
+        <w:tc>
+          <w:tcPr>
+            <w:tcW w:type="dxa" w:w="3120"/>
+            <w:shd w:val="clear" w:color="auto" w:fill="EBF2FA"/>
+            <w:tcBorders>
+              <w:top w:val="single" w:sz="4" w:color="B0C4DE"/>
+              <w:left w:val="single" w:sz="4" w:color="B0C4DE"/>
+              <w:bottom w:val="single" w:sz="4" w:color="B0C4DE"/>
+              <w:right w:val="single" w:sz="4" w:color="B0C4DE"/>
+            </w:tcBorders>
+            <w:vAlign w:val="center"/>
+          </w:tcPr>
+          <w:p>
+            <w:r>
+              <w:rPr>
+                <w:color w:val="2A3A50"/>
+                <w:sz w:val="19"/>
+              </w:rPr>
+              <w:t>hoAccepted[id]</w:t>
+            </w:r>
+          </w:p>
+        </w:tc>
+        <w:tc>
+          <w:tcPr>
+            <w:tcW w:type="dxa" w:w="3120"/>
+            <w:shd w:val="clear" w:color="auto" w:fill="EBF2FA"/>
+            <w:tcBorders>
+              <w:top w:val="single" w:sz="4" w:color="B0C4DE"/>
+              <w:left w:val="single" w:sz="4" w:color="B0C4DE"/>
+              <w:bottom w:val="single" w:sz="4" w:color="B0C4DE"/>
+              <w:right w:val="single" w:sz="4" w:color="B0C4DE"/>
+            </w:tcBorders>
+            <w:vAlign w:val="center"/>
+          </w:tcPr>
+          <w:p>
+            <w:r>
+              <w:rPr>
+                <w:color w:val="2A3A50"/>
+                <w:sz w:val="19"/>
+              </w:rPr>
+              <w:t>HO</w:t>
+            </w:r>
+          </w:p>
+        </w:tc>
+        <w:tc>
+          <w:tcPr>
+            <w:tcW w:type="dxa" w:w="3120"/>
+            <w:shd w:val="clear" w:color="auto" w:fill="EBF2FA"/>
+            <w:tcBorders>
+              <w:top w:val="single" w:sz="4" w:color="B0C4DE"/>
+              <w:left w:val="single" w:sz="4" w:color="B0C4DE"/>
+              <w:bottom w:val="single" w:sz="4" w:color="B0C4DE"/>
+              <w:right w:val="single" w:sz="4" w:color="B0C4DE"/>
+            </w:tcBorders>
+            <w:vAlign w:val="center"/>
+          </w:tcPr>
+          <w:p>
+            <w:r>
+              <w:rPr>
+                <w:color w:val="2A3A50"/>
+                <w:sz w:val="19"/>
+              </w:rPr>
+              <w:t>True when HO confirms the RO correction is satisfactory.</w:t>
+            </w:r>
+          </w:p>
+        </w:tc>
+      </w:tr>
+      <w:tr>
+        <w:tc>
+          <w:tcPr>
+            <w:tcW w:type="dxa" w:w="3120"/>
+            <w:shd w:val="clear" w:color="auto" w:fill="F5F8FC"/>
+            <w:tcBorders>
+              <w:top w:val="single" w:sz="4" w:color="B0C4DE"/>
+              <w:left w:val="single" w:sz="4" w:color="B0C4DE"/>
+              <w:bottom w:val="single" w:sz="4" w:color="B0C4DE"/>
+              <w:right w:val="single" w:sz="4" w:color="B0C4DE"/>
+            </w:tcBorders>
+            <w:vAlign w:val="center"/>
+          </w:tcPr>
+          <w:p>
+            <w:r>
+              <w:rPr>
+                <w:color w:val="2A3A50"/>
+                <w:sz w:val="19"/>
+              </w:rPr>
+              <w:t>wordingChanges[id]</w:t>
+            </w:r>
+          </w:p>
+        </w:tc>
+        <w:tc>
+          <w:tcPr>
+            <w:tcW w:type="dxa" w:w="3120"/>
+            <w:shd w:val="clear" w:color="auto" w:fill="F5F8FC"/>
+            <w:tcBorders>
+              <w:top w:val="single" w:sz="4" w:color="B0C4DE"/>
+              <w:left w:val="single" w:sz="4" w:color="B0C4DE"/>
+              <w:bottom w:val="single" w:sz="4" w:color="B0C4DE"/>
+              <w:right w:val="single" w:sz="4" w:color="B0C4DE"/>
+            </w:tcBorders>
+            <w:vAlign w:val="center"/>
+          </w:tcPr>
+          <w:p>
+            <w:r>
+              <w:rPr>
+                <w:color w:val="2A3A50"/>
+                <w:sz w:val="19"/>
+              </w:rPr>
+              <w:t>System (auto)</w:t>
+            </w:r>
+          </w:p>
+        </w:tc>
+        <w:tc>
+          <w:tcPr>
+            <w:tcW w:type="dxa" w:w="3120"/>
+            <w:shd w:val="clear" w:color="auto" w:fill="F5F8FC"/>
+            <w:tcBorders>
+              <w:top w:val="single" w:sz="4" w:color="B0C4DE"/>
+              <w:left w:val="single" w:sz="4" w:color="B0C4DE"/>
+              <w:bottom w:val="single" w:sz="4" w:color="B0C4DE"/>
+              <w:right w:val="single" w:sz="4" w:color="B0C4DE"/>
+            </w:tcBorders>
+            <w:vAlign w:val="center"/>
+          </w:tcPr>
+          <w:p>
+            <w:r>
+              <w:rPr>
+                <w:color w:val="2A3A50"/>
+                <w:sz w:val="19"/>
+              </w:rPr>
+              <w:t>Auto-detected difference between original databank text and auditor-edited text. Stored as {original, edited, detectedAt}.</w:t>
+            </w:r>
+          </w:p>
+        </w:tc>
+      </w:tr>
+    </w:tbl>
+    <w:p>
+      <w:r>
+        <w:br w:type="page"/>
+      </w:r>
+    </w:p>
+    <w:p>
+      <w:r>
+        <w:rPr>
+          <w:b/>
+          <w:color w:val="1A3A5C"/>
+          <w:sz w:val="26"/>
+        </w:rPr>
+        <w:t>SECTION 6 — Auditee Response Amendment (RO/HO Authority)</w:t>
+      </w:r>
+    </w:p>
+    <w:p>
+      <w:r>
+        <w:rPr>
+          <w:i/>
+          <w:color w:val="555555"/>
+          <w:sz w:val="19"/>
+        </w:rPr>
+        <w:t>RO and HO have special authority to amend branch responses when formal communication (email/letter) justifies a change.</w:t>
       </w:r>
     </w:p>
     <w:p>
@@ -1460,7 +3340,7 @@
           <w:color w:val="2A3A50"/>
           <w:sz w:val="19"/>
         </w:rPr>
-        <w:t>🔵  Default — Shows system suggestion, labelled "System Suggested"</w:t>
+        <w:t>Branch response field is locked for the Auditor — cannot be changed after loading.</w:t>
       </w:r>
     </w:p>
     <w:p>
@@ -1473,7 +3353,7 @@
           <w:color w:val="2A3A50"/>
           <w:sz w:val="19"/>
         </w:rPr>
-        <w:t>🟢  Confirmed — Shows auditor's selection, labelled "Auditor Confirmed" (accepted or overridden)</w:t>
+        <w:t>RO/HO see an "Amend Response" button per observation (hidden from Auditor view).</w:t>
       </w:r>
     </w:p>
     <w:p>
@@ -1486,14 +3366,62 @@
           <w:color w:val="2A3A50"/>
           <w:sz w:val="19"/>
         </w:rPr>
-        <w:t>⚠️   Override — If auditor's choice differs from system, event is logged in Audit Trail</w:t>
+        <w:t>When clicked: original branch response shown read-only + amendment text field + mandatory evidence attachment field + reason/note.</w:t>
       </w:r>
     </w:p>
     <w:p>
+      <w:pPr>
+        <w:pStyle w:val="ListBullet"/>
+        <w:ind w:left="432"/>
+      </w:pPr>
       <w:r>
-        <w:br w:type="page"/>
+        <w:rPr>
+          <w:color w:val="2A3A50"/>
+          <w:sz w:val="19"/>
+        </w:rPr>
+        <w:t>Evidence attachment: a file (email screenshot, letter scan, PDF) uploaded and saved alongside the session. HO receives it as a separate file — opens it independently.</w:t>
       </w:r>
     </w:p>
+    <w:p>
+      <w:pPr>
+        <w:pStyle w:val="ListBullet"/>
+        <w:ind w:left="432"/>
+      </w:pPr>
+      <w:r>
+        <w:rPr>
+          <w:color w:val="2A3A50"/>
+          <w:sz w:val="19"/>
+        </w:rPr>
+        <w:t>System permanently preserves: original response, amended response, attached evidence, who amended (RO/HO), timestamp.</w:t>
+      </w:r>
+    </w:p>
+    <w:p>
+      <w:pPr>
+        <w:pStyle w:val="ListBullet"/>
+        <w:ind w:left="432"/>
+      </w:pPr>
+      <w:r>
+        <w:rPr>
+          <w:color w:val="2A3A50"/>
+          <w:sz w:val="19"/>
+        </w:rPr>
+        <w:t>Amended responses are marked with a visible indicator in the issued report.</w:t>
+      </w:r>
+    </w:p>
+    <w:p>
+      <w:pPr>
+        <w:pStyle w:val="ListBullet"/>
+        <w:ind w:left="432"/>
+      </w:pPr>
+      <w:r>
+        <w:rPr>
+          <w:color w:val="2A3A50"/>
+          <w:sz w:val="19"/>
+        </w:rPr>
+        <w:t>All amendments are automatically logged in the Audit Trail as event type: "Auditee Response Amendment".</w:t>
+      </w:r>
+    </w:p>
+    <w:p/>
     <w:p>
       <w:r>
         <w:rPr>
@@ -1501,7 +3429,7 @@
           <w:color w:val="1A3A5C"/>
           <w:sz w:val="26"/>
         </w:rPr>
-        <w:t>AUDIT TRAIL — Separate Section  (Not Part of Issued Report)</w:t>
+        <w:t>SECTION 7 — Reviewer File  (bss_reviewer.html)</w:t>
       </w:r>
     </w:p>
     <w:p>
@@ -1511,7 +3439,7 @@
           <w:color w:val="555555"/>
           <w:sz w:val="19"/>
         </w:rPr>
-        <w:t>Purpose: Records all instances where auditor judgment differed from the system recommendation. Kept separate from the report to maintain report cleanliness while preserving full accountability.</w:t>
+        <w:t>A separate lightweight file used by RO Manager and HO for review. Auditor creation tools are not present.</w:t>
       </w:r>
     </w:p>
     <w:p/>
@@ -1522,20 +3450,181 @@
           <w:color w:val="1A3A5C"/>
           <w:sz w:val="22"/>
         </w:rPr>
-        <w:t>Events Logged in Audit Trail:</w:t>
+        <w:t>How It Works</w:t>
+      </w:r>
+    </w:p>
+    <w:p>
+      <w:pPr>
+        <w:pStyle w:val="ListBullet"/>
+        <w:ind w:left="432"/>
+      </w:pPr>
+      <w:r>
+        <w:rPr>
+          <w:color w:val="2A3A50"/>
+          <w:sz w:val="19"/>
+        </w:rPr>
+        <w:t>Auditor clicks "Send to RO" button in index.html — generates a single self-contained bss_reviewer.html file with all session data embedded inside it.</w:t>
+      </w:r>
+    </w:p>
+    <w:p>
+      <w:pPr>
+        <w:pStyle w:val="ListBullet"/>
+        <w:ind w:left="432"/>
+      </w:pPr>
+      <w:r>
+        <w:rPr>
+          <w:color w:val="2A3A50"/>
+          <w:sz w:val="19"/>
+        </w:rPr>
+        <w:t>RO Manager opens bss_reviewer.html directly in browser — no other file needed.</w:t>
+      </w:r>
+    </w:p>
+    <w:p>
+      <w:pPr>
+        <w:pStyle w:val="ListBullet"/>
+        <w:ind w:left="432"/>
+      </w:pPr>
+      <w:r>
+        <w:rPr>
+          <w:color w:val="2A3A50"/>
+          <w:sz w:val="19"/>
+        </w:rPr>
+        <w:t>RO reviews, flags, comments, attaches evidence, then clicks "Forward to HO" or "Send Back to Auditor".</w:t>
+      </w:r>
+    </w:p>
+    <w:p>
+      <w:pPr>
+        <w:pStyle w:val="ListBullet"/>
+        <w:ind w:left="432"/>
+      </w:pPr>
+      <w:r>
+        <w:rPr>
+          <w:color w:val="2A3A50"/>
+          <w:sz w:val="19"/>
+        </w:rPr>
+        <w:t>This generates a new output file which is emailed to HO or returned to Auditor.</w:t>
+      </w:r>
+    </w:p>
+    <w:p>
+      <w:pPr>
+        <w:pStyle w:val="ListBullet"/>
+        <w:ind w:left="432"/>
+      </w:pPr>
+      <w:r>
+        <w:rPr>
+          <w:color w:val="2A3A50"/>
+          <w:sz w:val="19"/>
+        </w:rPr>
+        <w:t>HO opens the same bss_reviewer.html type file — session data inside tells it this is HO stage.</w:t>
+      </w:r>
+    </w:p>
+    <w:p>
+      <w:pPr>
+        <w:pStyle w:val="ListBullet"/>
+        <w:ind w:left="432"/>
+      </w:pPr>
+      <w:r>
+        <w:rPr>
+          <w:color w:val="2A3A50"/>
+          <w:sz w:val="19"/>
+        </w:rPr>
+        <w:t>One bss_reviewer.html template serves both RO and HO — the reportStage flag controls what is shown.</w:t>
+      </w:r>
+    </w:p>
+    <w:p/>
+    <w:p>
+      <w:r>
+        <w:rPr>
+          <w:b/>
+          <w:color w:val="1A3A5C"/>
+          <w:sz w:val="22"/>
+        </w:rPr>
+        <w:t>Wording Change Display at Review Stage</w:t>
+      </w:r>
+    </w:p>
+    <w:p>
+      <w:pPr>
+        <w:pStyle w:val="ListBullet"/>
+        <w:ind w:left="432"/>
+      </w:pPr>
+      <w:r>
+        <w:rPr>
+          <w:color w:val="2A3A50"/>
+          <w:sz w:val="19"/>
+        </w:rPr>
+        <w:t>Any observation where the auditor edited the text shows a side-by-side comparison: Original (databank text) on left, Edited (auditor version) on right.</w:t>
+      </w:r>
+    </w:p>
+    <w:p>
+      <w:pPr>
+        <w:pStyle w:val="ListBullet"/>
+        <w:ind w:left="432"/>
+      </w:pPr>
+      <w:r>
+        <w:rPr>
+          <w:color w:val="2A3A50"/>
+          <w:sz w:val="19"/>
+        </w:rPr>
+        <w:t>Changes are highlighted in colour — deleted text in red, added text in green.</w:t>
+      </w:r>
+    </w:p>
+    <w:p>
+      <w:pPr>
+        <w:pStyle w:val="ListBullet"/>
+        <w:ind w:left="432"/>
+      </w:pPr>
+      <w:r>
+        <w:rPr>
+          <w:color w:val="2A3A50"/>
+          <w:sz w:val="19"/>
+        </w:rPr>
+        <w:t>RO/HO can Accept or Decline each wording change individually, or Accept All / Decline All.</w:t>
+      </w:r>
+    </w:p>
+    <w:p>
+      <w:pPr>
+        <w:pStyle w:val="ListBullet"/>
+        <w:ind w:left="432"/>
+      </w:pPr>
+      <w:r>
+        <w:rPr>
+          <w:color w:val="2A3A50"/>
+          <w:sz w:val="19"/>
+        </w:rPr>
+        <w:t>Declined changes revert to original databank wording before the file moves to the next stage.</w:t>
+      </w:r>
+    </w:p>
+    <w:p/>
+    <w:p>
+      <w:r>
+        <w:rPr>
+          <w:b/>
+          <w:color w:val="1A3A5C"/>
+          <w:sz w:val="26"/>
+        </w:rPr>
+        <w:t>SECTION 8 — Audit Trail</w:t>
+      </w:r>
+    </w:p>
+    <w:p>
+      <w:r>
+        <w:rPr>
+          <w:i/>
+          <w:color w:val="555555"/>
+          <w:sz w:val="19"/>
+        </w:rPr>
+        <w:t>A unified log of all overrides, changes, and decisions across all stages. Separate from the issued report.</w:t>
       </w:r>
     </w:p>
     <w:tbl>
       <w:tblPr>
         <w:tblStyle w:val="TableGrid"/>
         <w:tblW w:type="auto" w:w="0"/>
-        <w:tblLayout w:type="fixed"/>
         <w:tblLook w:firstColumn="1" w:firstRow="1" w:lastColumn="0" w:lastRow="0" w:noHBand="0" w:noVBand="1" w:val="04A0"/>
       </w:tblPr>
       <w:tblGrid>
-        <w:gridCol w:w="2592"/>
-        <w:gridCol w:w="3600"/>
-        <w:gridCol w:w="3888"/>
+        <w:gridCol w:w="3168"/>
+        <w:gridCol w:w="2880"/>
+        <w:gridCol w:w="4032"/>
       </w:tblGrid>
       <w:tr>
         <w:tc>
@@ -1586,7 +3675,7 @@
                 <w:color w:val="FFFFFF"/>
                 <w:sz w:val="20"/>
               </w:rPr>
-              <w:t>What is Recorded</w:t>
+              <w:t>Triggered By</w:t>
             </w:r>
           </w:p>
         </w:tc>
@@ -1612,7 +3701,7 @@
                 <w:color w:val="FFFFFF"/>
                 <w:sz w:val="20"/>
               </w:rPr>
-              <w:t>When Triggered</w:t>
+              <w:t>What is Recorded</w:t>
             </w:r>
           </w:p>
         </w:tc>
@@ -1631,9 +3720,6 @@
             <w:vAlign w:val="center"/>
           </w:tcPr>
           <w:p>
-            <w:pPr>
-              <w:jc w:val="left"/>
-            </w:pPr>
             <w:r>
               <w:rPr>
                 <w:color w:val="2A3A50"/>
@@ -1656,15 +3742,12 @@
             <w:vAlign w:val="center"/>
           </w:tcPr>
           <w:p>
-            <w:pPr>
-              <w:jc w:val="left"/>
-            </w:pPr>
             <w:r>
               <w:rPr>
                 <w:color w:val="2A3A50"/>
                 <w:sz w:val="19"/>
               </w:rPr>
-              <w:t>Observation ID &amp; title, system recommendation + its basis (databank score, Diligent rating, instances, financial impact), auditor's final selection, date &amp; time</w:t>
+              <w:t>Auditor</w:t>
             </w:r>
           </w:p>
         </w:tc>
@@ -1681,15 +3764,12 @@
             <w:vAlign w:val="center"/>
           </w:tcPr>
           <w:p>
-            <w:pPr>
-              <w:jc w:val="left"/>
-            </w:pPr>
             <w:r>
               <w:rPr>
                 <w:color w:val="2A3A50"/>
                 <w:sz w:val="19"/>
               </w:rPr>
-              <w:t>Auditor selects a Sensitivity different from the system suggestion and confirms</w:t>
+              <w:t>Observation, system recommendation + basis, auditor selection, timestamp</w:t>
             </w:r>
           </w:p>
         </w:tc>
@@ -1708,15 +3788,12 @@
             <w:vAlign w:val="center"/>
           </w:tcPr>
           <w:p>
-            <w:pPr>
-              <w:jc w:val="left"/>
-            </w:pPr>
             <w:r>
               <w:rPr>
                 <w:color w:val="2A3A50"/>
                 <w:sz w:val="19"/>
               </w:rPr>
-              <w:t>SRR Reassignment</w:t>
+              <w:t>COSO Change</w:t>
             </w:r>
           </w:p>
         </w:tc>
@@ -1733,15 +3810,12 @@
             <w:vAlign w:val="center"/>
           </w:tcPr>
           <w:p>
-            <w:pPr>
-              <w:jc w:val="left"/>
-            </w:pPr>
             <w:r>
               <w:rPr>
                 <w:color w:val="2A3A50"/>
                 <w:sz w:val="19"/>
               </w:rPr>
-              <w:t>Observation ID &amp; title, original auto-matched SRR code &amp; name, auditor's new SRR or custom-defined risk, date &amp; time</w:t>
+              <w:t>Auditor</w:t>
             </w:r>
           </w:p>
         </w:tc>
@@ -1758,15 +3832,12 @@
             <w:vAlign w:val="center"/>
           </w:tcPr>
           <w:p>
-            <w:pPr>
-              <w:jc w:val="left"/>
-            </w:pPr>
             <w:r>
               <w:rPr>
                 <w:color w:val="2A3A50"/>
                 <w:sz w:val="19"/>
               </w:rPr>
-              <w:t>Auditor reassigns an observation to a different Sub-Risk in the mapping tool</w:t>
+              <w:t>Observation, previous COSO, new COSO, timestamp</w:t>
             </w:r>
           </w:p>
         </w:tc>
@@ -1785,15 +3856,12 @@
             <w:vAlign w:val="center"/>
           </w:tcPr>
           <w:p>
-            <w:pPr>
-              <w:jc w:val="left"/>
-            </w:pPr>
             <w:r>
               <w:rPr>
                 <w:color w:val="2A3A50"/>
                 <w:sz w:val="19"/>
               </w:rPr>
-              <w:t>COSO Category Change</w:t>
+              <w:t>SRR Reassignment</w:t>
             </w:r>
           </w:p>
         </w:tc>
@@ -1810,15 +3878,12 @@
             <w:vAlign w:val="center"/>
           </w:tcPr>
           <w:p>
-            <w:pPr>
-              <w:jc w:val="left"/>
-            </w:pPr>
             <w:r>
               <w:rPr>
                 <w:color w:val="2A3A50"/>
                 <w:sz w:val="19"/>
               </w:rPr>
-              <w:t>Observation ID &amp; title, system-suggested COSO category, auditor's selected category, date &amp; time</w:t>
+              <w:t>Auditor</w:t>
             </w:r>
           </w:p>
         </w:tc>
@@ -1835,15 +3900,216 @@
             <w:vAlign w:val="center"/>
           </w:tcPr>
           <w:p>
-            <w:pPr>
-              <w:jc w:val="left"/>
-            </w:pPr>
             <w:r>
               <w:rPr>
                 <w:color w:val="2A3A50"/>
                 <w:sz w:val="19"/>
               </w:rPr>
-              <w:t>Auditor changes the COSO classification of an observation</w:t>
+              <w:t>Observation, original auto-matched SRR, new SRR or custom risk, note, timestamp</w:t>
+            </w:r>
+          </w:p>
+        </w:tc>
+      </w:tr>
+      <w:tr>
+        <w:tc>
+          <w:tcPr>
+            <w:tcW w:type="dxa" w:w="3120"/>
+            <w:shd w:val="clear" w:color="auto" w:fill="EBF2FA"/>
+            <w:tcBorders>
+              <w:top w:val="single" w:sz="4" w:color="B0C4DE"/>
+              <w:left w:val="single" w:sz="4" w:color="B0C4DE"/>
+              <w:bottom w:val="single" w:sz="4" w:color="B0C4DE"/>
+              <w:right w:val="single" w:sz="4" w:color="B0C4DE"/>
+            </w:tcBorders>
+            <w:vAlign w:val="center"/>
+          </w:tcPr>
+          <w:p>
+            <w:r>
+              <w:rPr>
+                <w:color w:val="2A3A50"/>
+                <w:sz w:val="19"/>
+              </w:rPr>
+              <w:t>Wording Change</w:t>
+            </w:r>
+          </w:p>
+        </w:tc>
+        <w:tc>
+          <w:tcPr>
+            <w:tcW w:type="dxa" w:w="3120"/>
+            <w:shd w:val="clear" w:color="auto" w:fill="EBF2FA"/>
+            <w:tcBorders>
+              <w:top w:val="single" w:sz="4" w:color="B0C4DE"/>
+              <w:left w:val="single" w:sz="4" w:color="B0C4DE"/>
+              <w:bottom w:val="single" w:sz="4" w:color="B0C4DE"/>
+              <w:right w:val="single" w:sz="4" w:color="B0C4DE"/>
+            </w:tcBorders>
+            <w:vAlign w:val="center"/>
+          </w:tcPr>
+          <w:p>
+            <w:r>
+              <w:rPr>
+                <w:color w:val="2A3A50"/>
+                <w:sz w:val="19"/>
+              </w:rPr>
+              <w:t>System (auto)</w:t>
+            </w:r>
+          </w:p>
+        </w:tc>
+        <w:tc>
+          <w:tcPr>
+            <w:tcW w:type="dxa" w:w="3120"/>
+            <w:shd w:val="clear" w:color="auto" w:fill="EBF2FA"/>
+            <w:tcBorders>
+              <w:top w:val="single" w:sz="4" w:color="B0C4DE"/>
+              <w:left w:val="single" w:sz="4" w:color="B0C4DE"/>
+              <w:bottom w:val="single" w:sz="4" w:color="B0C4DE"/>
+              <w:right w:val="single" w:sz="4" w:color="B0C4DE"/>
+            </w:tcBorders>
+            <w:vAlign w:val="center"/>
+          </w:tcPr>
+          <w:p>
+            <w:r>
+              <w:rPr>
+                <w:color w:val="2A3A50"/>
+                <w:sz w:val="19"/>
+              </w:rPr>
+              <w:t>Observation, original text, edited text, detected at timestamp</w:t>
+            </w:r>
+          </w:p>
+        </w:tc>
+      </w:tr>
+      <w:tr>
+        <w:tc>
+          <w:tcPr>
+            <w:tcW w:type="dxa" w:w="3120"/>
+            <w:shd w:val="clear" w:color="auto" w:fill="F5F8FC"/>
+            <w:tcBorders>
+              <w:top w:val="single" w:sz="4" w:color="B0C4DE"/>
+              <w:left w:val="single" w:sz="4" w:color="B0C4DE"/>
+              <w:bottom w:val="single" w:sz="4" w:color="B0C4DE"/>
+              <w:right w:val="single" w:sz="4" w:color="B0C4DE"/>
+            </w:tcBorders>
+            <w:vAlign w:val="center"/>
+          </w:tcPr>
+          <w:p>
+            <w:r>
+              <w:rPr>
+                <w:color w:val="2A3A50"/>
+                <w:sz w:val="19"/>
+              </w:rPr>
+              <w:t>Auditee Response Amendment</w:t>
+            </w:r>
+          </w:p>
+        </w:tc>
+        <w:tc>
+          <w:tcPr>
+            <w:tcW w:type="dxa" w:w="3120"/>
+            <w:shd w:val="clear" w:color="auto" w:fill="F5F8FC"/>
+            <w:tcBorders>
+              <w:top w:val="single" w:sz="4" w:color="B0C4DE"/>
+              <w:left w:val="single" w:sz="4" w:color="B0C4DE"/>
+              <w:bottom w:val="single" w:sz="4" w:color="B0C4DE"/>
+              <w:right w:val="single" w:sz="4" w:color="B0C4DE"/>
+            </w:tcBorders>
+            <w:vAlign w:val="center"/>
+          </w:tcPr>
+          <w:p>
+            <w:r>
+              <w:rPr>
+                <w:color w:val="2A3A50"/>
+                <w:sz w:val="19"/>
+              </w:rPr>
+              <w:t>RO or HO</w:t>
+            </w:r>
+          </w:p>
+        </w:tc>
+        <w:tc>
+          <w:tcPr>
+            <w:tcW w:type="dxa" w:w="3120"/>
+            <w:shd w:val="clear" w:color="auto" w:fill="F5F8FC"/>
+            <w:tcBorders>
+              <w:top w:val="single" w:sz="4" w:color="B0C4DE"/>
+              <w:left w:val="single" w:sz="4" w:color="B0C4DE"/>
+              <w:bottom w:val="single" w:sz="4" w:color="B0C4DE"/>
+              <w:right w:val="single" w:sz="4" w:color="B0C4DE"/>
+            </w:tcBorders>
+            <w:vAlign w:val="center"/>
+          </w:tcPr>
+          <w:p>
+            <w:r>
+              <w:rPr>
+                <w:color w:val="2A3A50"/>
+                <w:sz w:val="19"/>
+              </w:rPr>
+              <w:t>Observation, original response, amended response, evidence file reference, who amended, timestamp</w:t>
+            </w:r>
+          </w:p>
+        </w:tc>
+      </w:tr>
+      <w:tr>
+        <w:tc>
+          <w:tcPr>
+            <w:tcW w:type="dxa" w:w="3120"/>
+            <w:shd w:val="clear" w:color="auto" w:fill="EBF2FA"/>
+            <w:tcBorders>
+              <w:top w:val="single" w:sz="4" w:color="B0C4DE"/>
+              <w:left w:val="single" w:sz="4" w:color="B0C4DE"/>
+              <w:bottom w:val="single" w:sz="4" w:color="B0C4DE"/>
+              <w:right w:val="single" w:sz="4" w:color="B0C4DE"/>
+            </w:tcBorders>
+            <w:vAlign w:val="center"/>
+          </w:tcPr>
+          <w:p>
+            <w:r>
+              <w:rPr>
+                <w:color w:val="2A3A50"/>
+                <w:sz w:val="19"/>
+              </w:rPr>
+              <w:t>Send Back</w:t>
+            </w:r>
+          </w:p>
+        </w:tc>
+        <w:tc>
+          <w:tcPr>
+            <w:tcW w:type="dxa" w:w="3120"/>
+            <w:shd w:val="clear" w:color="auto" w:fill="EBF2FA"/>
+            <w:tcBorders>
+              <w:top w:val="single" w:sz="4" w:color="B0C4DE"/>
+              <w:left w:val="single" w:sz="4" w:color="B0C4DE"/>
+              <w:bottom w:val="single" w:sz="4" w:color="B0C4DE"/>
+              <w:right w:val="single" w:sz="4" w:color="B0C4DE"/>
+            </w:tcBorders>
+            <w:vAlign w:val="center"/>
+          </w:tcPr>
+          <w:p>
+            <w:r>
+              <w:rPr>
+                <w:color w:val="2A3A50"/>
+                <w:sz w:val="19"/>
+              </w:rPr>
+              <w:t>RO or HO</w:t>
+            </w:r>
+          </w:p>
+        </w:tc>
+        <w:tc>
+          <w:tcPr>
+            <w:tcW w:type="dxa" w:w="3120"/>
+            <w:shd w:val="clear" w:color="auto" w:fill="EBF2FA"/>
+            <w:tcBorders>
+              <w:top w:val="single" w:sz="4" w:color="B0C4DE"/>
+              <w:left w:val="single" w:sz="4" w:color="B0C4DE"/>
+              <w:bottom w:val="single" w:sz="4" w:color="B0C4DE"/>
+              <w:right w:val="single" w:sz="4" w:color="B0C4DE"/>
+            </w:tcBorders>
+            <w:vAlign w:val="center"/>
+          </w:tcPr>
+          <w:p>
+            <w:r>
+              <w:rPr>
+                <w:color w:val="2A3A50"/>
+                <w:sz w:val="19"/>
+              </w:rPr>
+              <w:t>Stage, observations flagged, comments per observation, timestamp</w:t>
             </w:r>
           </w:p>
         </w:tc>
@@ -1857,7 +4123,7 @@
           <w:color w:val="1A3A5C"/>
           <w:sz w:val="22"/>
         </w:rPr>
-        <w:t>Audit Trail Features:</w:t>
+        <w:t>Audit Trail Features</w:t>
       </w:r>
     </w:p>
     <w:p>
@@ -1870,7 +4136,7 @@
           <w:color w:val="2A3A50"/>
           <w:sz w:val="19"/>
         </w:rPr>
-        <w:t>Viewable as a filterable list inside the system (filter by event type, observation, date)</w:t>
+        <w:t>Viewable as filterable list inside the system (filter by event type, observation, date, stage)</w:t>
       </w:r>
     </w:p>
     <w:p>
@@ -1883,7 +4149,7 @@
           <w:color w:val="2A3A50"/>
           <w:sz w:val="19"/>
         </w:rPr>
-        <w:t>Downloadable as Excel or PDF report for external reference</w:t>
+        <w:t>Downloadable as CSV/Excel for permanent external record</w:t>
       </w:r>
     </w:p>
     <w:p>
@@ -1896,7 +4162,7 @@
           <w:color w:val="2A3A50"/>
           <w:sz w:val="19"/>
         </w:rPr>
-        <w:t>Saved persistently in browser localStorage (key: sa_audit_trail)</w:t>
+        <w:t>Persistent via browser localStorage (key: sa_audit_trail)</w:t>
       </w:r>
     </w:p>
     <w:p>
@@ -1909,7 +4175,7 @@
           <w:color w:val="2A3A50"/>
           <w:sz w:val="19"/>
         </w:rPr>
-        <w:t>Accessible via dedicated "Audit Trail" button in the main system</w:t>
+        <w:t>Accessible via dedicated Audit Trail button in index.html toolbar</w:t>
       </w:r>
     </w:p>
     <w:p>
@@ -1922,10 +4188,14 @@
           <w:color w:val="2A3A50"/>
           <w:sz w:val="19"/>
         </w:rPr>
-        <w:t>Unified — captures overrides from all tabs/sections in one place</w:t>
+        <w:t>All events from all stages — auditor, RO, HO — captured in one unified trail</w:t>
       </w:r>
     </w:p>
-    <w:p/>
+    <w:p>
+      <w:r>
+        <w:br w:type="page"/>
+      </w:r>
+    </w:p>
     <w:p>
       <w:r>
         <w:rPr>
@@ -1933,24 +4203,24 @@
           <w:color w:val="1A3A5C"/>
           <w:sz w:val="26"/>
         </w:rPr>
-        <w:t>INTEGRATION &amp; IMPLEMENTATION SEQUENCE</w:t>
+        <w:t>SECTION 9 — Implementation Sequence</w:t>
       </w:r>
     </w:p>
     <w:tbl>
       <w:tblPr>
         <w:tblStyle w:val="TableGrid"/>
         <w:tblW w:type="auto" w:w="0"/>
-        <w:tblLayout w:type="fixed"/>
         <w:tblLook w:firstColumn="1" w:firstRow="1" w:lastColumn="0" w:lastRow="0" w:noHBand="0" w:noVBand="1" w:val="04A0"/>
       </w:tblPr>
       <w:tblGrid>
-        <w:gridCol w:w="1440"/>
-        <w:gridCol w:w="8640"/>
+        <w:gridCol w:w="1152"/>
+        <w:gridCol w:w="5040"/>
+        <w:gridCol w:w="3888"/>
       </w:tblGrid>
       <w:tr>
         <w:tc>
           <w:tcPr>
-            <w:tcW w:type="dxa" w:w="4680"/>
+            <w:tcW w:type="dxa" w:w="3120"/>
             <w:shd w:val="clear" w:color="auto" w:fill="1A3A5C"/>
             <w:tcBorders>
               <w:top w:val="single" w:sz="4" w:color="B0C4DE"/>
@@ -1976,7 +4246,7 @@
         </w:tc>
         <w:tc>
           <w:tcPr>
-            <w:tcW w:type="dxa" w:w="4680"/>
+            <w:tcW w:type="dxa" w:w="3120"/>
             <w:shd w:val="clear" w:color="auto" w:fill="1A3A5C"/>
             <w:tcBorders>
               <w:top w:val="single" w:sz="4" w:color="B0C4DE"/>
@@ -2000,11 +4270,445 @@
             </w:r>
           </w:p>
         </w:tc>
+        <w:tc>
+          <w:tcPr>
+            <w:tcW w:type="dxa" w:w="3120"/>
+            <w:shd w:val="clear" w:color="auto" w:fill="1A3A5C"/>
+            <w:tcBorders>
+              <w:top w:val="single" w:sz="4" w:color="B0C4DE"/>
+              <w:left w:val="single" w:sz="4" w:color="B0C4DE"/>
+              <w:bottom w:val="single" w:sz="4" w:color="B0C4DE"/>
+              <w:right w:val="single" w:sz="4" w:color="B0C4DE"/>
+            </w:tcBorders>
+            <w:vAlign w:val="center"/>
+          </w:tcPr>
+          <w:p>
+            <w:pPr>
+              <w:jc w:val="center"/>
+            </w:pPr>
+            <w:r>
+              <w:rPr>
+                <w:b/>
+                <w:color w:val="FFFFFF"/>
+                <w:sz w:val="20"/>
+              </w:rPr>
+              <w:t>Status</w:t>
+            </w:r>
+          </w:p>
+        </w:tc>
       </w:tr>
       <w:tr>
         <w:tc>
           <w:tcPr>
-            <w:tcW w:type="dxa" w:w="4680"/>
+            <w:tcW w:type="dxa" w:w="3120"/>
+            <w:shd w:val="clear" w:color="auto" w:fill="E8F8E8"/>
+            <w:tcBorders>
+              <w:top w:val="single" w:sz="4" w:color="B0C4DE"/>
+              <w:left w:val="single" w:sz="4" w:color="B0C4DE"/>
+              <w:bottom w:val="single" w:sz="4" w:color="B0C4DE"/>
+              <w:right w:val="single" w:sz="4" w:color="B0C4DE"/>
+            </w:tcBorders>
+            <w:vAlign w:val="center"/>
+          </w:tcPr>
+          <w:p>
+            <w:r>
+              <w:rPr>
+                <w:color w:val="2A3A50"/>
+                <w:sz w:val="19"/>
+              </w:rPr>
+              <w:t>1</w:t>
+            </w:r>
+          </w:p>
+        </w:tc>
+        <w:tc>
+          <w:tcPr>
+            <w:tcW w:type="dxa" w:w="3120"/>
+            <w:shd w:val="clear" w:color="auto" w:fill="E8F8E8"/>
+            <w:tcBorders>
+              <w:top w:val="single" w:sz="4" w:color="B0C4DE"/>
+              <w:left w:val="single" w:sz="4" w:color="B0C4DE"/>
+              <w:bottom w:val="single" w:sz="4" w:color="B0C4DE"/>
+              <w:right w:val="single" w:sz="4" w:color="B0C4DE"/>
+            </w:tcBorders>
+            <w:vAlign w:val="center"/>
+          </w:tcPr>
+          <w:p>
+            <w:r>
+              <w:rPr>
+                <w:color w:val="2A3A50"/>
+                <w:sz w:val="19"/>
+              </w:rPr>
+              <w:t>Wire Diligent Impact &amp; Likelihood into Area Weight (Part 1 formula)</w:t>
+            </w:r>
+          </w:p>
+        </w:tc>
+        <w:tc>
+          <w:tcPr>
+            <w:tcW w:type="dxa" w:w="3120"/>
+            <w:shd w:val="clear" w:color="auto" w:fill="E8F8E8"/>
+            <w:tcBorders>
+              <w:top w:val="single" w:sz="4" w:color="B0C4DE"/>
+              <w:left w:val="single" w:sz="4" w:color="B0C4DE"/>
+              <w:bottom w:val="single" w:sz="4" w:color="B0C4DE"/>
+              <w:right w:val="single" w:sz="4" w:color="B0C4DE"/>
+            </w:tcBorders>
+            <w:vAlign w:val="center"/>
+          </w:tcPr>
+          <w:p>
+            <w:r>
+              <w:rPr>
+                <w:color w:val="2A3A50"/>
+                <w:sz w:val="19"/>
+              </w:rPr>
+              <w:t>✔ Complete</w:t>
+            </w:r>
+          </w:p>
+        </w:tc>
+      </w:tr>
+      <w:tr>
+        <w:tc>
+          <w:tcPr>
+            <w:tcW w:type="dxa" w:w="3120"/>
+            <w:shd w:val="clear" w:color="auto" w:fill="E8F8E8"/>
+            <w:tcBorders>
+              <w:top w:val="single" w:sz="4" w:color="B0C4DE"/>
+              <w:left w:val="single" w:sz="4" w:color="B0C4DE"/>
+              <w:bottom w:val="single" w:sz="4" w:color="B0C4DE"/>
+              <w:right w:val="single" w:sz="4" w:color="B0C4DE"/>
+            </w:tcBorders>
+            <w:vAlign w:val="center"/>
+          </w:tcPr>
+          <w:p>
+            <w:r>
+              <w:rPr>
+                <w:color w:val="2A3A50"/>
+                <w:sz w:val="19"/>
+              </w:rPr>
+              <w:t>2</w:t>
+            </w:r>
+          </w:p>
+        </w:tc>
+        <w:tc>
+          <w:tcPr>
+            <w:tcW w:type="dxa" w:w="3120"/>
+            <w:shd w:val="clear" w:color="auto" w:fill="E8F8E8"/>
+            <w:tcBorders>
+              <w:top w:val="single" w:sz="4" w:color="B0C4DE"/>
+              <w:left w:val="single" w:sz="4" w:color="B0C4DE"/>
+              <w:bottom w:val="single" w:sz="4" w:color="B0C4DE"/>
+              <w:right w:val="single" w:sz="4" w:color="B0C4DE"/>
+            </w:tcBorders>
+            <w:vAlign w:val="center"/>
+          </w:tcPr>
+          <w:p>
+            <w:r>
+              <w:rPr>
+                <w:color w:val="2A3A50"/>
+                <w:sz w:val="19"/>
+              </w:rPr>
+              <w:t>Build Part 2 system recommendation engine (Branch History + Diligent + Materiality)</w:t>
+            </w:r>
+          </w:p>
+        </w:tc>
+        <w:tc>
+          <w:tcPr>
+            <w:tcW w:type="dxa" w:w="3120"/>
+            <w:shd w:val="clear" w:color="auto" w:fill="E8F8E8"/>
+            <w:tcBorders>
+              <w:top w:val="single" w:sz="4" w:color="B0C4DE"/>
+              <w:left w:val="single" w:sz="4" w:color="B0C4DE"/>
+              <w:bottom w:val="single" w:sz="4" w:color="B0C4DE"/>
+              <w:right w:val="single" w:sz="4" w:color="B0C4DE"/>
+            </w:tcBorders>
+            <w:vAlign w:val="center"/>
+          </w:tcPr>
+          <w:p>
+            <w:r>
+              <w:rPr>
+                <w:color w:val="2A3A50"/>
+                <w:sz w:val="19"/>
+              </w:rPr>
+              <w:t>✔ Complete</w:t>
+            </w:r>
+          </w:p>
+        </w:tc>
+      </w:tr>
+      <w:tr>
+        <w:tc>
+          <w:tcPr>
+            <w:tcW w:type="dxa" w:w="3120"/>
+            <w:shd w:val="clear" w:color="auto" w:fill="E8F8E8"/>
+            <w:tcBorders>
+              <w:top w:val="single" w:sz="4" w:color="B0C4DE"/>
+              <w:left w:val="single" w:sz="4" w:color="B0C4DE"/>
+              <w:bottom w:val="single" w:sz="4" w:color="B0C4DE"/>
+              <w:right w:val="single" w:sz="4" w:color="B0C4DE"/>
+            </w:tcBorders>
+            <w:vAlign w:val="center"/>
+          </w:tcPr>
+          <w:p>
+            <w:r>
+              <w:rPr>
+                <w:color w:val="2A3A50"/>
+                <w:sz w:val="19"/>
+              </w:rPr>
+              <w:t>3</w:t>
+            </w:r>
+          </w:p>
+        </w:tc>
+        <w:tc>
+          <w:tcPr>
+            <w:tcW w:type="dxa" w:w="3120"/>
+            <w:shd w:val="clear" w:color="auto" w:fill="E8F8E8"/>
+            <w:tcBorders>
+              <w:top w:val="single" w:sz="4" w:color="B0C4DE"/>
+              <w:left w:val="single" w:sz="4" w:color="B0C4DE"/>
+              <w:bottom w:val="single" w:sz="4" w:color="B0C4DE"/>
+              <w:right w:val="single" w:sz="4" w:color="B0C4DE"/>
+            </w:tcBorders>
+            <w:vAlign w:val="center"/>
+          </w:tcPr>
+          <w:p>
+            <w:r>
+              <w:rPr>
+                <w:color w:val="2A3A50"/>
+                <w:sz w:val="19"/>
+              </w:rPr>
+              <w:t>Sensitivity confirmation prompt + Audit Trail logging for overrides</w:t>
+            </w:r>
+          </w:p>
+        </w:tc>
+        <w:tc>
+          <w:tcPr>
+            <w:tcW w:type="dxa" w:w="3120"/>
+            <w:shd w:val="clear" w:color="auto" w:fill="E8F8E8"/>
+            <w:tcBorders>
+              <w:top w:val="single" w:sz="4" w:color="B0C4DE"/>
+              <w:left w:val="single" w:sz="4" w:color="B0C4DE"/>
+              <w:bottom w:val="single" w:sz="4" w:color="B0C4DE"/>
+              <w:right w:val="single" w:sz="4" w:color="B0C4DE"/>
+            </w:tcBorders>
+            <w:vAlign w:val="center"/>
+          </w:tcPr>
+          <w:p>
+            <w:r>
+              <w:rPr>
+                <w:color w:val="2A3A50"/>
+                <w:sz w:val="19"/>
+              </w:rPr>
+              <w:t>✔ Complete</w:t>
+            </w:r>
+          </w:p>
+        </w:tc>
+      </w:tr>
+      <w:tr>
+        <w:tc>
+          <w:tcPr>
+            <w:tcW w:type="dxa" w:w="3120"/>
+            <w:shd w:val="clear" w:color="auto" w:fill="E8F8E8"/>
+            <w:tcBorders>
+              <w:top w:val="single" w:sz="4" w:color="B0C4DE"/>
+              <w:left w:val="single" w:sz="4" w:color="B0C4DE"/>
+              <w:bottom w:val="single" w:sz="4" w:color="B0C4DE"/>
+              <w:right w:val="single" w:sz="4" w:color="B0C4DE"/>
+            </w:tcBorders>
+            <w:vAlign w:val="center"/>
+          </w:tcPr>
+          <w:p>
+            <w:r>
+              <w:rPr>
+                <w:color w:val="2A3A50"/>
+                <w:sz w:val="19"/>
+              </w:rPr>
+              <w:t>4</w:t>
+            </w:r>
+          </w:p>
+        </w:tc>
+        <w:tc>
+          <w:tcPr>
+            <w:tcW w:type="dxa" w:w="3120"/>
+            <w:shd w:val="clear" w:color="auto" w:fill="E8F8E8"/>
+            <w:tcBorders>
+              <w:top w:val="single" w:sz="4" w:color="B0C4DE"/>
+              <w:left w:val="single" w:sz="4" w:color="B0C4DE"/>
+              <w:bottom w:val="single" w:sz="4" w:color="B0C4DE"/>
+              <w:right w:val="single" w:sz="4" w:color="B0C4DE"/>
+            </w:tcBorders>
+            <w:vAlign w:val="center"/>
+          </w:tcPr>
+          <w:p>
+            <w:r>
+              <w:rPr>
+                <w:color w:val="2A3A50"/>
+                <w:sz w:val="19"/>
+              </w:rPr>
+              <w:t>COSO change logging to Audit Trail</w:t>
+            </w:r>
+          </w:p>
+        </w:tc>
+        <w:tc>
+          <w:tcPr>
+            <w:tcW w:type="dxa" w:w="3120"/>
+            <w:shd w:val="clear" w:color="auto" w:fill="E8F8E8"/>
+            <w:tcBorders>
+              <w:top w:val="single" w:sz="4" w:color="B0C4DE"/>
+              <w:left w:val="single" w:sz="4" w:color="B0C4DE"/>
+              <w:bottom w:val="single" w:sz="4" w:color="B0C4DE"/>
+              <w:right w:val="single" w:sz="4" w:color="B0C4DE"/>
+            </w:tcBorders>
+            <w:vAlign w:val="center"/>
+          </w:tcPr>
+          <w:p>
+            <w:r>
+              <w:rPr>
+                <w:color w:val="2A3A50"/>
+                <w:sz w:val="19"/>
+              </w:rPr>
+              <w:t>✔ Complete</w:t>
+            </w:r>
+          </w:p>
+        </w:tc>
+      </w:tr>
+      <w:tr>
+        <w:tc>
+          <w:tcPr>
+            <w:tcW w:type="dxa" w:w="3120"/>
+            <w:shd w:val="clear" w:color="auto" w:fill="E8F8E8"/>
+            <w:tcBorders>
+              <w:top w:val="single" w:sz="4" w:color="B0C4DE"/>
+              <w:left w:val="single" w:sz="4" w:color="B0C4DE"/>
+              <w:bottom w:val="single" w:sz="4" w:color="B0C4DE"/>
+              <w:right w:val="single" w:sz="4" w:color="B0C4DE"/>
+            </w:tcBorders>
+            <w:vAlign w:val="center"/>
+          </w:tcPr>
+          <w:p>
+            <w:r>
+              <w:rPr>
+                <w:color w:val="2A3A50"/>
+                <w:sz w:val="19"/>
+              </w:rPr>
+              <w:t>5</w:t>
+            </w:r>
+          </w:p>
+        </w:tc>
+        <w:tc>
+          <w:tcPr>
+            <w:tcW w:type="dxa" w:w="3120"/>
+            <w:shd w:val="clear" w:color="auto" w:fill="E8F8E8"/>
+            <w:tcBorders>
+              <w:top w:val="single" w:sz="4" w:color="B0C4DE"/>
+              <w:left w:val="single" w:sz="4" w:color="B0C4DE"/>
+              <w:bottom w:val="single" w:sz="4" w:color="B0C4DE"/>
+              <w:right w:val="single" w:sz="4" w:color="B0C4DE"/>
+            </w:tcBorders>
+            <w:vAlign w:val="center"/>
+          </w:tcPr>
+          <w:p>
+            <w:r>
+              <w:rPr>
+                <w:color w:val="2A3A50"/>
+                <w:sz w:val="19"/>
+              </w:rPr>
+              <w:t>Audit Trail panel in index.html (view, filter, export CSV)</w:t>
+            </w:r>
+          </w:p>
+        </w:tc>
+        <w:tc>
+          <w:tcPr>
+            <w:tcW w:type="dxa" w:w="3120"/>
+            <w:shd w:val="clear" w:color="auto" w:fill="E8F8E8"/>
+            <w:tcBorders>
+              <w:top w:val="single" w:sz="4" w:color="B0C4DE"/>
+              <w:left w:val="single" w:sz="4" w:color="B0C4DE"/>
+              <w:bottom w:val="single" w:sz="4" w:color="B0C4DE"/>
+              <w:right w:val="single" w:sz="4" w:color="B0C4DE"/>
+            </w:tcBorders>
+            <w:vAlign w:val="center"/>
+          </w:tcPr>
+          <w:p>
+            <w:r>
+              <w:rPr>
+                <w:color w:val="2A3A50"/>
+                <w:sz w:val="19"/>
+              </w:rPr>
+              <w:t>✔ Complete</w:t>
+            </w:r>
+          </w:p>
+        </w:tc>
+      </w:tr>
+      <w:tr>
+        <w:tc>
+          <w:tcPr>
+            <w:tcW w:type="dxa" w:w="3120"/>
+            <w:shd w:val="clear" w:color="auto" w:fill="E8F8E8"/>
+            <w:tcBorders>
+              <w:top w:val="single" w:sz="4" w:color="B0C4DE"/>
+              <w:left w:val="single" w:sz="4" w:color="B0C4DE"/>
+              <w:bottom w:val="single" w:sz="4" w:color="B0C4DE"/>
+              <w:right w:val="single" w:sz="4" w:color="B0C4DE"/>
+            </w:tcBorders>
+            <w:vAlign w:val="center"/>
+          </w:tcPr>
+          <w:p>
+            <w:r>
+              <w:rPr>
+                <w:color w:val="2A3A50"/>
+                <w:sz w:val="19"/>
+              </w:rPr>
+              <w:t>6</w:t>
+            </w:r>
+          </w:p>
+        </w:tc>
+        <w:tc>
+          <w:tcPr>
+            <w:tcW w:type="dxa" w:w="3120"/>
+            <w:shd w:val="clear" w:color="auto" w:fill="E8F8E8"/>
+            <w:tcBorders>
+              <w:top w:val="single" w:sz="4" w:color="B0C4DE"/>
+              <w:left w:val="single" w:sz="4" w:color="B0C4DE"/>
+              <w:bottom w:val="single" w:sz="4" w:color="B0C4DE"/>
+              <w:right w:val="single" w:sz="4" w:color="B0C4DE"/>
+            </w:tcBorders>
+            <w:vAlign w:val="center"/>
+          </w:tcPr>
+          <w:p>
+            <w:r>
+              <w:rPr>
+                <w:color w:val="2A3A50"/>
+                <w:sz w:val="19"/>
+              </w:rPr>
+              <w:t>SRR Mapping tab integrated inside index.html with Audit Trail integration</w:t>
+            </w:r>
+          </w:p>
+        </w:tc>
+        <w:tc>
+          <w:tcPr>
+            <w:tcW w:type="dxa" w:w="3120"/>
+            <w:shd w:val="clear" w:color="auto" w:fill="E8F8E8"/>
+            <w:tcBorders>
+              <w:top w:val="single" w:sz="4" w:color="B0C4DE"/>
+              <w:left w:val="single" w:sz="4" w:color="B0C4DE"/>
+              <w:bottom w:val="single" w:sz="4" w:color="B0C4DE"/>
+              <w:right w:val="single" w:sz="4" w:color="B0C4DE"/>
+            </w:tcBorders>
+            <w:vAlign w:val="center"/>
+          </w:tcPr>
+          <w:p>
+            <w:r>
+              <w:rPr>
+                <w:color w:val="2A3A50"/>
+                <w:sz w:val="19"/>
+              </w:rPr>
+              <w:t>✔ Complete</w:t>
+            </w:r>
+          </w:p>
+        </w:tc>
+      </w:tr>
+      <w:tr>
+        <w:tc>
+          <w:tcPr>
+            <w:tcW w:type="dxa" w:w="3120"/>
             <w:shd w:val="clear" w:color="auto" w:fill="F5F8FC"/>
             <w:tcBorders>
               <w:top w:val="single" w:sz="4" w:color="B0C4DE"/>
@@ -2015,21 +4719,18 @@
             <w:vAlign w:val="center"/>
           </w:tcPr>
           <w:p>
-            <w:pPr>
-              <w:jc w:val="left"/>
-            </w:pPr>
             <w:r>
               <w:rPr>
                 <w:color w:val="2A3A50"/>
                 <w:sz w:val="19"/>
               </w:rPr>
-              <w:t>Step 1</w:t>
+              <w:t>7</w:t>
             </w:r>
           </w:p>
         </w:tc>
         <w:tc>
           <w:tcPr>
-            <w:tcW w:type="dxa" w:w="4680"/>
+            <w:tcW w:type="dxa" w:w="3120"/>
             <w:shd w:val="clear" w:color="auto" w:fill="F5F8FC"/>
             <w:tcBorders>
               <w:top w:val="single" w:sz="4" w:color="B0C4DE"/>
@@ -2040,15 +4741,34 @@
             <w:vAlign w:val="center"/>
           </w:tcPr>
           <w:p>
-            <w:pPr>
-              <w:jc w:val="left"/>
-            </w:pPr>
             <w:r>
               <w:rPr>
                 <w:color w:val="2A3A50"/>
                 <w:sz w:val="19"/>
               </w:rPr>
-              <w:t>Wire Diligent Impact &amp; Likelihood into Area Weight in Part 1 formula</w:t>
+              <w:t>Wording change auto-detection (obsEdits vs original DB.observations)</w:t>
+            </w:r>
+          </w:p>
+        </w:tc>
+        <w:tc>
+          <w:tcPr>
+            <w:tcW w:type="dxa" w:w="3120"/>
+            <w:shd w:val="clear" w:color="auto" w:fill="F5F8FC"/>
+            <w:tcBorders>
+              <w:top w:val="single" w:sz="4" w:color="B0C4DE"/>
+              <w:left w:val="single" w:sz="4" w:color="B0C4DE"/>
+              <w:bottom w:val="single" w:sz="4" w:color="B0C4DE"/>
+              <w:right w:val="single" w:sz="4" w:color="B0C4DE"/>
+            </w:tcBorders>
+            <w:vAlign w:val="center"/>
+          </w:tcPr>
+          <w:p>
+            <w:r>
+              <w:rPr>
+                <w:color w:val="2A3A50"/>
+                <w:sz w:val="19"/>
+              </w:rPr>
+              <w:t>Pending</w:t>
             </w:r>
           </w:p>
         </w:tc>
@@ -2056,7 +4776,7 @@
       <w:tr>
         <w:tc>
           <w:tcPr>
-            <w:tcW w:type="dxa" w:w="4680"/>
+            <w:tcW w:type="dxa" w:w="3120"/>
             <w:shd w:val="clear" w:color="auto" w:fill="EBF2FA"/>
             <w:tcBorders>
               <w:top w:val="single" w:sz="4" w:color="B0C4DE"/>
@@ -2067,21 +4787,18 @@
             <w:vAlign w:val="center"/>
           </w:tcPr>
           <w:p>
-            <w:pPr>
-              <w:jc w:val="left"/>
-            </w:pPr>
             <w:r>
               <w:rPr>
                 <w:color w:val="2A3A50"/>
                 <w:sz w:val="19"/>
               </w:rPr>
-              <w:t>Step 2</w:t>
+              <w:t>8</w:t>
             </w:r>
           </w:p>
         </w:tc>
         <w:tc>
           <w:tcPr>
-            <w:tcW w:type="dxa" w:w="4680"/>
+            <w:tcW w:type="dxa" w:w="3120"/>
             <w:shd w:val="clear" w:color="auto" w:fill="EBF2FA"/>
             <w:tcBorders>
               <w:top w:val="single" w:sz="4" w:color="B0C4DE"/>
@@ -2092,15 +4809,34 @@
             <w:vAlign w:val="center"/>
           </w:tcPr>
           <w:p>
-            <w:pPr>
-              <w:jc w:val="left"/>
-            </w:pPr>
             <w:r>
               <w:rPr>
                 <w:color w:val="2A3A50"/>
                 <w:sz w:val="19"/>
               </w:rPr>
-              <w:t>Build Part 2 system recommendation engine (branch-specific history + Diligent + Materiality)</w:t>
+              <w:t>RO/HO auditee response amendment with evidence attachment</w:t>
+            </w:r>
+          </w:p>
+        </w:tc>
+        <w:tc>
+          <w:tcPr>
+            <w:tcW w:type="dxa" w:w="3120"/>
+            <w:shd w:val="clear" w:color="auto" w:fill="EBF2FA"/>
+            <w:tcBorders>
+              <w:top w:val="single" w:sz="4" w:color="B0C4DE"/>
+              <w:left w:val="single" w:sz="4" w:color="B0C4DE"/>
+              <w:bottom w:val="single" w:sz="4" w:color="B0C4DE"/>
+              <w:right w:val="single" w:sz="4" w:color="B0C4DE"/>
+            </w:tcBorders>
+            <w:vAlign w:val="center"/>
+          </w:tcPr>
+          <w:p>
+            <w:r>
+              <w:rPr>
+                <w:color w:val="2A3A50"/>
+                <w:sz w:val="19"/>
+              </w:rPr>
+              <w:t>Pending</w:t>
             </w:r>
           </w:p>
         </w:tc>
@@ -2108,7 +4844,7 @@
       <w:tr>
         <w:tc>
           <w:tcPr>
-            <w:tcW w:type="dxa" w:w="4680"/>
+            <w:tcW w:type="dxa" w:w="3120"/>
             <w:shd w:val="clear" w:color="auto" w:fill="F5F8FC"/>
             <w:tcBorders>
               <w:top w:val="single" w:sz="4" w:color="B0C4DE"/>
@@ -2119,21 +4855,18 @@
             <w:vAlign w:val="center"/>
           </w:tcPr>
           <w:p>
-            <w:pPr>
-              <w:jc w:val="left"/>
-            </w:pPr>
             <w:r>
               <w:rPr>
                 <w:color w:val="2A3A50"/>
                 <w:sz w:val="19"/>
               </w:rPr>
-              <w:t>Step 3</w:t>
+              <w:t>9</w:t>
             </w:r>
           </w:p>
         </w:tc>
         <w:tc>
           <w:tcPr>
-            <w:tcW w:type="dxa" w:w="4680"/>
+            <w:tcW w:type="dxa" w:w="3120"/>
             <w:shd w:val="clear" w:color="auto" w:fill="F5F8FC"/>
             <w:tcBorders>
               <w:top w:val="single" w:sz="4" w:color="B0C4DE"/>
@@ -2144,15 +4877,34 @@
             <w:vAlign w:val="center"/>
           </w:tcPr>
           <w:p>
-            <w:pPr>
-              <w:jc w:val="left"/>
-            </w:pPr>
             <w:r>
               <w:rPr>
                 <w:color w:val="2A3A50"/>
                 <w:sz w:val="19"/>
               </w:rPr>
-              <w:t>Add confirmation prompt and System Suggested / Auditor Confirmed states to Sensitivity combo box</w:t>
+              <w:t>bss_reviewer.html — RO/HO reviewer file (stage-aware, review-only interface)</w:t>
+            </w:r>
+          </w:p>
+        </w:tc>
+        <w:tc>
+          <w:tcPr>
+            <w:tcW w:type="dxa" w:w="3120"/>
+            <w:shd w:val="clear" w:color="auto" w:fill="F5F8FC"/>
+            <w:tcBorders>
+              <w:top w:val="single" w:sz="4" w:color="B0C4DE"/>
+              <w:left w:val="single" w:sz="4" w:color="B0C4DE"/>
+              <w:bottom w:val="single" w:sz="4" w:color="B0C4DE"/>
+              <w:right w:val="single" w:sz="4" w:color="B0C4DE"/>
+            </w:tcBorders>
+            <w:vAlign w:val="center"/>
+          </w:tcPr>
+          <w:p>
+            <w:r>
+              <w:rPr>
+                <w:color w:val="2A3A50"/>
+                <w:sz w:val="19"/>
+              </w:rPr>
+              <w:t>Pending</w:t>
             </w:r>
           </w:p>
         </w:tc>
@@ -2160,7 +4912,7 @@
       <w:tr>
         <w:tc>
           <w:tcPr>
-            <w:tcW w:type="dxa" w:w="4680"/>
+            <w:tcW w:type="dxa" w:w="3120"/>
             <w:shd w:val="clear" w:color="auto" w:fill="EBF2FA"/>
             <w:tcBorders>
               <w:top w:val="single" w:sz="4" w:color="B0C4DE"/>
@@ -2171,21 +4923,18 @@
             <w:vAlign w:val="center"/>
           </w:tcPr>
           <w:p>
-            <w:pPr>
-              <w:jc w:val="left"/>
-            </w:pPr>
             <w:r>
               <w:rPr>
                 <w:color w:val="2A3A50"/>
                 <w:sz w:val="19"/>
               </w:rPr>
-              <w:t>Step 4</w:t>
+              <w:t>10</w:t>
             </w:r>
           </w:p>
         </w:tc>
         <w:tc>
           <w:tcPr>
-            <w:tcW w:type="dxa" w:w="4680"/>
+            <w:tcW w:type="dxa" w:w="3120"/>
             <w:shd w:val="clear" w:color="auto" w:fill="EBF2FA"/>
             <w:tcBorders>
               <w:top w:val="single" w:sz="4" w:color="B0C4DE"/>
@@ -2196,75 +4945,18 @@
             <w:vAlign w:val="center"/>
           </w:tcPr>
           <w:p>
-            <w:pPr>
-              <w:jc w:val="left"/>
-            </w:pPr>
             <w:r>
               <w:rPr>
                 <w:color w:val="2A3A50"/>
                 <w:sz w:val="19"/>
               </w:rPr>
-              <w:t>Build Audit Trail section in index.html with view, download, and save functionality</w:t>
-            </w:r>
-          </w:p>
-        </w:tc>
-      </w:tr>
-      <w:tr>
-        <w:tc>
-          <w:tcPr>
-            <w:tcW w:type="dxa" w:w="4680"/>
-            <w:shd w:val="clear" w:color="auto" w:fill="F5F8FC"/>
-            <w:tcBorders>
-              <w:top w:val="single" w:sz="4" w:color="B0C4DE"/>
-              <w:left w:val="single" w:sz="4" w:color="B0C4DE"/>
-              <w:bottom w:val="single" w:sz="4" w:color="B0C4DE"/>
-              <w:right w:val="single" w:sz="4" w:color="B0C4DE"/>
-            </w:tcBorders>
-            <w:vAlign w:val="center"/>
-          </w:tcPr>
-          <w:p>
-            <w:pPr>
-              <w:jc w:val="left"/>
-            </w:pPr>
-            <w:r>
-              <w:rPr>
-                <w:color w:val="2A3A50"/>
-                <w:sz w:val="19"/>
-              </w:rPr>
-              <w:t>Step 5</w:t>
+              <w:t>Send Back mechanism — Auditor correction view + RO/HO re-receive view with comments</w:t>
             </w:r>
           </w:p>
         </w:tc>
         <w:tc>
           <w:tcPr>
-            <w:tcW w:type="dxa" w:w="4680"/>
-            <w:shd w:val="clear" w:color="auto" w:fill="F5F8FC"/>
-            <w:tcBorders>
-              <w:top w:val="single" w:sz="4" w:color="B0C4DE"/>
-              <w:left w:val="single" w:sz="4" w:color="B0C4DE"/>
-              <w:bottom w:val="single" w:sz="4" w:color="B0C4DE"/>
-              <w:right w:val="single" w:sz="4" w:color="B0C4DE"/>
-            </w:tcBorders>
-            <w:vAlign w:val="center"/>
-          </w:tcPr>
-          <w:p>
-            <w:pPr>
-              <w:jc w:val="left"/>
-            </w:pPr>
-            <w:r>
-              <w:rPr>
-                <w:color w:val="2A3A50"/>
-                <w:sz w:val="19"/>
-              </w:rPr>
-              <w:t>Integrate obs_srr_mapping.html as a dedicated tab inside index.html</w:t>
-            </w:r>
-          </w:p>
-        </w:tc>
-      </w:tr>
-      <w:tr>
-        <w:tc>
-          <w:tcPr>
-            <w:tcW w:type="dxa" w:w="4680"/>
+            <w:tcW w:type="dxa" w:w="3120"/>
             <w:shd w:val="clear" w:color="auto" w:fill="EBF2FA"/>
             <w:tcBorders>
               <w:top w:val="single" w:sz="4" w:color="B0C4DE"/>
@@ -2275,40 +4967,12 @@
             <w:vAlign w:val="center"/>
           </w:tcPr>
           <w:p>
-            <w:pPr>
-              <w:jc w:val="left"/>
-            </w:pPr>
             <w:r>
               <w:rPr>
                 <w:color w:val="2A3A50"/>
                 <w:sz w:val="19"/>
               </w:rPr>
-              <w:t>Step 6</w:t>
-            </w:r>
-          </w:p>
-        </w:tc>
-        <w:tc>
-          <w:tcPr>
-            <w:tcW w:type="dxa" w:w="4680"/>
-            <w:shd w:val="clear" w:color="auto" w:fill="EBF2FA"/>
-            <w:tcBorders>
-              <w:top w:val="single" w:sz="4" w:color="B0C4DE"/>
-              <w:left w:val="single" w:sz="4" w:color="B0C4DE"/>
-              <w:bottom w:val="single" w:sz="4" w:color="B0C4DE"/>
-              <w:right w:val="single" w:sz="4" w:color="B0C4DE"/>
-            </w:tcBorders>
-            <w:vAlign w:val="center"/>
-          </w:tcPr>
-          <w:p>
-            <w:pPr>
-              <w:jc w:val="left"/>
-            </w:pPr>
-            <w:r>
-              <w:rPr>
-                <w:color w:val="2A3A50"/>
-                <w:sz w:val="19"/>
-              </w:rPr>
-              <w:t>Connect all override events (sensitivity, SRR, COSO) to shared sa_audit_trail in localStorage</w:t>
+              <w:t>Pending</w:t>
             </w:r>
           </w:p>
         </w:tc>
@@ -2325,7 +4989,7 @@
           <w:color w:val="AAAAAA"/>
           <w:sz w:val="16"/>
         </w:rPr>
-        <w:t>BSS Audit Management System  |  Risk Assessment Framework v2.0  |  Prepared June 2026</w:t>
+        <w:t>BSS Audit Management System  |  Risk Assessment &amp; Review Framework v3.0  |  June 2026</w:t>
       </w:r>
     </w:p>
     <w:sectPr>

</xml_diff>